<commit_message>
feat:implemented websocket telemetry snsd compute node daemon
</commit_message>
<xml_diff>
--- a/Progress.docx
+++ b/Progress.docx
@@ -77,13 +77,18 @@
       </w:r>
       <w:proofErr w:type="spellEnd"/>
       <w:r>
-        <w:t xml:space="preserve"> root directory, initialized Git version control, and set up a precise .</w:t>
+        <w:t xml:space="preserve"> root directory, initialized Git version control, and set up a </w:t>
+      </w:r>
+      <w:proofErr w:type="gramStart"/>
+      <w:r>
+        <w:t>precise .</w:t>
       </w:r>
       <w:proofErr w:type="spellStart"/>
       <w:r>
         <w:t>gitignore</w:t>
       </w:r>
       <w:proofErr w:type="spellEnd"/>
+      <w:proofErr w:type="gramEnd"/>
       <w:r>
         <w:t xml:space="preserve"> file.</w:t>
       </w:r>
@@ -93,10 +98,12 @@
         <w:t xml:space="preserve">​Root Configuration: Rewrote the root </w:t>
       </w:r>
       <w:proofErr w:type="spellStart"/>
+      <w:proofErr w:type="gramStart"/>
       <w:r>
         <w:t>package.json</w:t>
       </w:r>
       <w:proofErr w:type="spellEnd"/>
+      <w:proofErr w:type="gramEnd"/>
       <w:r>
         <w:t xml:space="preserve"> to define the project as a </w:t>
       </w:r>
@@ -153,10 +160,12 @@
         <w:t xml:space="preserve">​Centralized Scripting: Mapped the </w:t>
       </w:r>
       <w:proofErr w:type="spellStart"/>
+      <w:proofErr w:type="gramStart"/>
       <w:r>
         <w:t>start:brain</w:t>
       </w:r>
       <w:proofErr w:type="spellEnd"/>
+      <w:proofErr w:type="gramEnd"/>
       <w:r>
         <w:t xml:space="preserve"> script in the root folder to securely execute the backend package from the top level.</w:t>
       </w:r>
@@ -190,10 +199,12 @@
         <w:t>​/</w:t>
       </w:r>
       <w:proofErr w:type="spellStart"/>
+      <w:proofErr w:type="gramStart"/>
       <w:r>
         <w:t>package.json</w:t>
       </w:r>
       <w:proofErr w:type="spellEnd"/>
+      <w:proofErr w:type="gramEnd"/>
       <w:r>
         <w:t xml:space="preserve"> (Root)</w:t>
       </w:r>
@@ -234,23 +245,30 @@
         <w:t>3. "scripts": {"</w:t>
       </w:r>
       <w:proofErr w:type="spellStart"/>
+      <w:proofErr w:type="gramStart"/>
       <w:r>
         <w:t>start:brain</w:t>
       </w:r>
       <w:proofErr w:type="spellEnd"/>
+      <w:proofErr w:type="gramEnd"/>
       <w:r>
         <w:t>": ...} allows us to start any sub-service without constantly navigating directories (cd).</w:t>
       </w:r>
     </w:p>
     <w:p>
       <w:r>
-        <w:t>​/.</w:t>
+        <w:t>​</w:t>
+      </w:r>
+      <w:proofErr w:type="gramStart"/>
+      <w:r>
+        <w:t>/.</w:t>
       </w:r>
       <w:proofErr w:type="spellStart"/>
       <w:r>
         <w:t>gitignore</w:t>
       </w:r>
       <w:proofErr w:type="spellEnd"/>
+      <w:proofErr w:type="gramEnd"/>
     </w:p>
     <w:p>
       <w:r>
@@ -285,8 +303,21 @@
       </w:r>
     </w:p>
     <w:p>
-      <w:r>
-        <w:t>​.env: Security. Prevents database passwords and API keys from being leaked to GitHub (the #1 way companies are hacked).</w:t>
+      <w:proofErr w:type="gramStart"/>
+      <w:r>
+        <w:t>​.env</w:t>
+      </w:r>
+      <w:proofErr w:type="gramEnd"/>
+      <w:r>
+        <w:t xml:space="preserve">: Security. Prevents database passwords and API keys from being leaked to GitHub (the </w:t>
+      </w:r>
+      <w:proofErr w:type="gramStart"/>
+      <w:r>
+        <w:t>#1 way</w:t>
+      </w:r>
+      <w:proofErr w:type="gramEnd"/>
+      <w:r>
+        <w:t xml:space="preserve"> companies are hacked).</w:t>
       </w:r>
     </w:p>
     <w:p>
@@ -342,10 +373,12 @@
         <w:t>​</w:t>
       </w:r>
       <w:proofErr w:type="spellStart"/>
+      <w:proofErr w:type="gramStart"/>
       <w:r>
         <w:t>package.json</w:t>
       </w:r>
       <w:proofErr w:type="spellEnd"/>
+      <w:proofErr w:type="gramEnd"/>
       <w:r>
         <w:t xml:space="preserve"> (Control Plane): Defines the specific dependencies isolated exclusively to the backend service.</w:t>
       </w:r>
@@ -471,10 +504,12 @@
         <w:t xml:space="preserve"> run </w:t>
       </w:r>
       <w:proofErr w:type="spellStart"/>
+      <w:proofErr w:type="gramStart"/>
       <w:r>
         <w:t>start:brain</w:t>
       </w:r>
       <w:proofErr w:type="spellEnd"/>
+      <w:proofErr w:type="gramEnd"/>
       <w:r>
         <w:t>.</w:t>
       </w:r>
@@ -545,8 +580,29 @@
       </w:r>
       <w:proofErr w:type="spellEnd"/>
       <w:r>
-        <w:t>: Invalid or unexpected token pointing directly to line 16 in server.js: console.log("Server running on http://localhost:${PORT});`</w:t>
-      </w:r>
+        <w:t xml:space="preserve">: Invalid or unexpected token pointing directly to line 16 in server.js: </w:t>
+      </w:r>
+      <w:proofErr w:type="gramStart"/>
+      <w:r>
+        <w:t>console.log(</w:t>
+      </w:r>
+      <w:proofErr w:type="gramEnd"/>
+      <w:r>
+        <w:t xml:space="preserve">"Server running on </w:t>
+      </w:r>
+      <w:proofErr w:type="gramStart"/>
+      <w:r>
+        <w:t>http://localhost:${</w:t>
+      </w:r>
+      <w:proofErr w:type="gramEnd"/>
+      <w:r>
+        <w:t>PORT}</w:t>
+      </w:r>
+      <w:proofErr w:type="gramStart"/>
+      <w:r>
+        <w:t>);`</w:t>
+      </w:r>
+      <w:proofErr w:type="gramEnd"/>
     </w:p>
     <w:p>
       <w:r>
@@ -555,7 +611,15 @@
     </w:p>
     <w:p>
       <w:r>
-        <w:t>​Resolution: Replaced the starting double-quote with a backtick to correctly format the template literal: console.log(`</w:t>
+        <w:t xml:space="preserve">​Resolution: Replaced the starting double-quote with a backtick to correctly format the template literal: </w:t>
+      </w:r>
+      <w:proofErr w:type="gramStart"/>
+      <w:r>
+        <w:t>console.log(</w:t>
+      </w:r>
+      <w:proofErr w:type="gramEnd"/>
+      <w:r>
+        <w:t>`</w:t>
       </w:r>
       <w:r>
         <w:rPr>
@@ -564,12 +628,2249 @@
         <w:t>🚀</w:t>
       </w:r>
       <w:r>
-        <w:t xml:space="preserve"> Server running on http://localhost:${PORT}`);.</w:t>
-      </w:r>
+        <w:t xml:space="preserve"> Server running on </w:t>
+      </w:r>
+      <w:proofErr w:type="gramStart"/>
+      <w:r>
+        <w:t>http://localhost:${</w:t>
+      </w:r>
+      <w:proofErr w:type="gramEnd"/>
+      <w:r>
+        <w:t>PORT}`</w:t>
+      </w:r>
+      <w:proofErr w:type="gramStart"/>
+      <w:r>
+        <w:t>);.</w:t>
+      </w:r>
+      <w:proofErr w:type="gramEnd"/>
     </w:p>
     <w:p>
       <w:r>
         <w:t>​Takeaway: Strict attention to syntax is required when transitioning between standard strings and template literals. Standard quotes interpret ${} as literal text characters rather than executable variables.</w:t>
+      </w:r>
+    </w:p>
+    <w:p/>
+    <w:p/>
+    <w:p/>
+    <w:p/>
+    <w:p/>
+    <w:p/>
+    <w:p/>
+    <w:p/>
+    <w:p/>
+    <w:p/>
+    <w:p/>
+    <w:p/>
+    <w:p/>
+    <w:p/>
+    <w:p/>
+    <w:p/>
+    <w:p>
+      <w:r>
+        <w:lastRenderedPageBreak/>
+        <w:t xml:space="preserve">That is a massive win! </w:t>
+      </w:r>
+      <w:r>
+        <w:rPr>
+          <w:rFonts w:ascii="Segoe UI Emoji" w:hAnsi="Segoe UI Emoji" w:cs="Segoe UI Emoji"/>
+        </w:rPr>
+        <w:t>🎉</w:t>
+      </w:r>
+      <w:r>
+        <w:t xml:space="preserve"> Seeing that first green checkmark on a GitHub Actions pipeline is a </w:t>
+      </w:r>
+      <w:proofErr w:type="spellStart"/>
+      <w:r>
+        <w:t>right</w:t>
+      </w:r>
+      <w:proofErr w:type="spellEnd"/>
+      <w:r>
+        <w:t xml:space="preserve"> of passage for every DevOps and Backend Engineer. You just built a fully automated QA robot in the cloud.</w:t>
+      </w:r>
+    </w:p>
+    <w:p>
+      <w:r>
+        <w:t>Here is your official Engineering Progress Report for Week 2. Copy this and add it to your PROGRESS.md file right below Week 1.</w:t>
+      </w:r>
+    </w:p>
+    <w:p>
+      <w:r>
+        <w:rPr>
+          <w:rFonts w:ascii="Segoe UI Emoji" w:hAnsi="Segoe UI Emoji" w:cs="Segoe UI Emoji"/>
+        </w:rPr>
+        <w:t>📝</w:t>
+      </w:r>
+      <w:r>
+        <w:t xml:space="preserve"> Engineering Log: Week 2</w:t>
+      </w:r>
+    </w:p>
+    <w:p>
+      <w:r>
+        <w:t>Project: Nexus Orchestrator (Enterprise Edition - JS)</w:t>
+      </w:r>
+    </w:p>
+    <w:p>
+      <w:r>
+        <w:t>Phase: 2 - Continuous Integration &amp; Code Quality</w:t>
+      </w:r>
+    </w:p>
+    <w:p>
+      <w:r>
+        <w:t xml:space="preserve">Status: </w:t>
+      </w:r>
+      <w:r>
+        <w:rPr>
+          <w:rFonts w:ascii="Segoe UI Emoji" w:hAnsi="Segoe UI Emoji" w:cs="Segoe UI Emoji"/>
+        </w:rPr>
+        <w:t>✅</w:t>
+      </w:r>
+      <w:r>
+        <w:t xml:space="preserve"> Completed</w:t>
+      </w:r>
+    </w:p>
+    <w:p>
+      <w:r>
+        <w:rPr>
+          <w:rFonts w:ascii="Segoe UI Emoji" w:hAnsi="Segoe UI Emoji" w:cs="Segoe UI Emoji"/>
+        </w:rPr>
+        <w:t>🛠️</w:t>
+      </w:r>
+      <w:r>
+        <w:t xml:space="preserve"> 1. What Was Accomplished (The Execution)</w:t>
+      </w:r>
+    </w:p>
+    <w:p>
+      <w:r>
+        <w:t xml:space="preserve"> * Code Formatting Automation: Installed and configured Prettier </w:t>
+      </w:r>
+      <w:proofErr w:type="gramStart"/>
+      <w:r>
+        <w:t>(.</w:t>
+      </w:r>
+      <w:proofErr w:type="spellStart"/>
+      <w:r>
+        <w:t>prettierrc</w:t>
+      </w:r>
+      <w:proofErr w:type="spellEnd"/>
+      <w:proofErr w:type="gramEnd"/>
+      <w:r>
+        <w:t xml:space="preserve">) to enforce a uniform code style (e.g., single quotes, consistent indentation) across the entire </w:t>
+      </w:r>
+      <w:proofErr w:type="spellStart"/>
+      <w:r>
+        <w:t>monorepo</w:t>
+      </w:r>
+      <w:proofErr w:type="spellEnd"/>
+      <w:r>
+        <w:t>.</w:t>
+      </w:r>
+    </w:p>
+    <w:p>
+      <w:r>
+        <w:t xml:space="preserve"> * Static Code Analysis: Installed </w:t>
+      </w:r>
+      <w:proofErr w:type="spellStart"/>
+      <w:r>
+        <w:t>ESLint</w:t>
+      </w:r>
+      <w:proofErr w:type="spellEnd"/>
+      <w:r>
+        <w:t xml:space="preserve"> to catch programmatic errors before runtime.</w:t>
+      </w:r>
+    </w:p>
+    <w:p>
+      <w:r>
+        <w:t xml:space="preserve"> * Modernized Tooling: Successfully navigated a major-version breaking change by migrating from the </w:t>
+      </w:r>
+      <w:proofErr w:type="gramStart"/>
+      <w:r>
+        <w:t>legacy .</w:t>
+      </w:r>
+      <w:proofErr w:type="spellStart"/>
+      <w:r>
+        <w:t>eslintrc</w:t>
+      </w:r>
+      <w:proofErr w:type="gramEnd"/>
+      <w:r>
+        <w:t>.json</w:t>
+      </w:r>
+      <w:proofErr w:type="spellEnd"/>
+      <w:r>
+        <w:t xml:space="preserve"> to the modern </w:t>
+      </w:r>
+      <w:proofErr w:type="spellStart"/>
+      <w:r>
+        <w:t>ESLint</w:t>
+      </w:r>
+      <w:proofErr w:type="spellEnd"/>
+      <w:r>
+        <w:t xml:space="preserve"> "Flat Config" (</w:t>
+      </w:r>
+      <w:proofErr w:type="spellStart"/>
+      <w:r>
+        <w:t>eslint.config.mjs</w:t>
+      </w:r>
+      <w:proofErr w:type="spellEnd"/>
+      <w:r>
+        <w:t>).</w:t>
+      </w:r>
+    </w:p>
+    <w:p>
+      <w:r>
+        <w:t xml:space="preserve"> * NPM Scripting: Created centralized lint and format scripts in the root </w:t>
+      </w:r>
+      <w:proofErr w:type="spellStart"/>
+      <w:proofErr w:type="gramStart"/>
+      <w:r>
+        <w:t>package.json</w:t>
+      </w:r>
+      <w:proofErr w:type="spellEnd"/>
+      <w:proofErr w:type="gramEnd"/>
+      <w:r>
+        <w:t xml:space="preserve"> to </w:t>
+      </w:r>
+      <w:proofErr w:type="spellStart"/>
+      <w:r>
+        <w:t>analyze</w:t>
+      </w:r>
+      <w:proofErr w:type="spellEnd"/>
+      <w:r>
+        <w:t xml:space="preserve"> the entire workspace with a single command.</w:t>
+      </w:r>
+    </w:p>
+    <w:p>
+      <w:r>
+        <w:t xml:space="preserve"> * Continuous Integration (CI) Pipeline: Engineered a GitHub Actions workflow (.</w:t>
+      </w:r>
+      <w:proofErr w:type="spellStart"/>
+      <w:r>
+        <w:t>github</w:t>
+      </w:r>
+      <w:proofErr w:type="spellEnd"/>
+      <w:r>
+        <w:t>/workflows/</w:t>
+      </w:r>
+      <w:proofErr w:type="spellStart"/>
+      <w:r>
+        <w:t>ci.yml</w:t>
+      </w:r>
+      <w:proofErr w:type="spellEnd"/>
+      <w:r>
+        <w:t>) that automatically spins up a Linux VM, installs Node.js, and runs the linter every time code is pushed to the main branch.</w:t>
+      </w:r>
+    </w:p>
+    <w:p>
+      <w:r>
+        <w:rPr>
+          <w:rFonts w:ascii="Segoe UI Emoji" w:hAnsi="Segoe UI Emoji" w:cs="Segoe UI Emoji"/>
+        </w:rPr>
+        <w:t>🧠</w:t>
+      </w:r>
+      <w:r>
+        <w:t xml:space="preserve"> 2. Engineering Rationale (The "Why")</w:t>
+      </w:r>
+    </w:p>
+    <w:p>
+      <w:r>
+        <w:t>In enterprise software, code is read 10x more than it is written. These tools ensure the codebase remains pristine as it scales.</w:t>
+      </w:r>
+    </w:p>
+    <w:p>
+      <w:r>
+        <w:t>Why Prettier?</w:t>
+      </w:r>
+    </w:p>
+    <w:p>
+      <w:r>
+        <w:t>Prettier is an "opinionated code formatter." When working on a team, developers often argue over spaces vs. tabs or single vs. double quotes. Prettier ends that debate by automatically reformatting the code on save. This keeps the Git commit history clean because every file looks like it was written by the exact same person.</w:t>
+      </w:r>
+    </w:p>
+    <w:p>
+      <w:r>
+        <w:t xml:space="preserve">Why </w:t>
+      </w:r>
+      <w:proofErr w:type="spellStart"/>
+      <w:r>
+        <w:t>ESLint</w:t>
+      </w:r>
+      <w:proofErr w:type="spellEnd"/>
+      <w:r>
+        <w:t>?</w:t>
+      </w:r>
+    </w:p>
+    <w:p>
+      <w:r>
+        <w:t xml:space="preserve">While Prettier makes code look good, </w:t>
+      </w:r>
+      <w:proofErr w:type="spellStart"/>
+      <w:r>
+        <w:t>ESLint</w:t>
+      </w:r>
+      <w:proofErr w:type="spellEnd"/>
+      <w:r>
+        <w:t xml:space="preserve"> makes sure the code works well. JavaScript is a dynamic language, meaning it doesn't catch certain errors until the code is actually running. </w:t>
+      </w:r>
+      <w:proofErr w:type="spellStart"/>
+      <w:r>
+        <w:t>ESLint</w:t>
+      </w:r>
+      <w:proofErr w:type="spellEnd"/>
+      <w:r>
+        <w:t xml:space="preserve"> performs "Static Analysis"—it reads the code and finds bugs (like unused variables, unreachable code, or missing imports) before the app ever starts.</w:t>
+      </w:r>
+    </w:p>
+    <w:p>
+      <w:r>
+        <w:t>Why GitHub Actions (CI)?</w:t>
+      </w:r>
+    </w:p>
+    <w:p>
+      <w:r>
+        <w:t xml:space="preserve">Developers make mistakes and sometimes forget to run </w:t>
+      </w:r>
+      <w:proofErr w:type="spellStart"/>
+      <w:r>
+        <w:t>npm</w:t>
+      </w:r>
+      <w:proofErr w:type="spellEnd"/>
+      <w:r>
+        <w:t xml:space="preserve"> run lint locally before pushing.</w:t>
+      </w:r>
+    </w:p>
+    <w:p>
+      <w:r>
+        <w:t xml:space="preserve"> * The Problem: Bad code gets merged, breaking the main project.</w:t>
+      </w:r>
+    </w:p>
+    <w:p>
+      <w:r>
+        <w:lastRenderedPageBreak/>
+        <w:t xml:space="preserve"> * The Solution: The .</w:t>
+      </w:r>
+      <w:proofErr w:type="spellStart"/>
+      <w:r>
+        <w:t>github</w:t>
+      </w:r>
+      <w:proofErr w:type="spellEnd"/>
+      <w:r>
+        <w:t>/workflows/</w:t>
+      </w:r>
+      <w:proofErr w:type="spellStart"/>
+      <w:r>
+        <w:t>ci.yml</w:t>
+      </w:r>
+      <w:proofErr w:type="spellEnd"/>
+      <w:r>
+        <w:t xml:space="preserve"> file creates a "Cloud Robot" (a CI Pipeline). It acts as a gatekeeper. If a developer pushes code with syntax errors, the pipeline fails (turns red) and blocks the code from being deployed to production. This is the absolute core of DevOps.</w:t>
+      </w:r>
+    </w:p>
+    <w:p>
+      <w:r>
+        <w:rPr>
+          <w:rFonts w:ascii="Segoe UI Emoji" w:hAnsi="Segoe UI Emoji" w:cs="Segoe UI Emoji"/>
+        </w:rPr>
+        <w:t>🐛</w:t>
+      </w:r>
+      <w:r>
+        <w:t xml:space="preserve"> 3. Tracks of Error &amp; Triage Log</w:t>
+      </w:r>
+    </w:p>
+    <w:p>
+      <w:r>
+        <w:t>Navigating tooling upgrades is a critical daily task for Senior Engineers. Here is how we handled this week's roadblocks:</w:t>
+      </w:r>
+    </w:p>
+    <w:p>
+      <w:r>
+        <w:t xml:space="preserve">Error Ticket #3: Deprecated </w:t>
+      </w:r>
+      <w:proofErr w:type="spellStart"/>
+      <w:r>
+        <w:t>ESLint</w:t>
+      </w:r>
+      <w:proofErr w:type="spellEnd"/>
+      <w:r>
+        <w:t xml:space="preserve"> Configuration Format</w:t>
+      </w:r>
+    </w:p>
+    <w:p>
+      <w:r>
+        <w:t xml:space="preserve"> * Symptom: Terminal threw </w:t>
+      </w:r>
+      <w:proofErr w:type="spellStart"/>
+      <w:r>
+        <w:t>ESLint</w:t>
+      </w:r>
+      <w:proofErr w:type="spellEnd"/>
+      <w:r>
+        <w:t xml:space="preserve"> couldn't find an </w:t>
+      </w:r>
+      <w:proofErr w:type="spellStart"/>
+      <w:r>
+        <w:t>eslint.</w:t>
+      </w:r>
+      <w:proofErr w:type="gramStart"/>
+      <w:r>
+        <w:t>config</w:t>
+      </w:r>
+      <w:proofErr w:type="spellEnd"/>
+      <w:r>
+        <w:t>.(</w:t>
+      </w:r>
+      <w:proofErr w:type="spellStart"/>
+      <w:proofErr w:type="gramEnd"/>
+      <w:r>
+        <w:t>js|mjs|cjs</w:t>
+      </w:r>
+      <w:proofErr w:type="spellEnd"/>
+      <w:r>
+        <w:t>) file and warned about a migration guide. GitHub Actions CI pipeline failed with exit code 2.</w:t>
+      </w:r>
+    </w:p>
+    <w:p>
+      <w:r>
+        <w:t xml:space="preserve"> * Root Cause Analysis: We initially configured </w:t>
+      </w:r>
+      <w:proofErr w:type="spellStart"/>
+      <w:r>
+        <w:t>ESLint</w:t>
+      </w:r>
+      <w:proofErr w:type="spellEnd"/>
+      <w:r>
+        <w:t xml:space="preserve"> </w:t>
+      </w:r>
+      <w:proofErr w:type="gramStart"/>
+      <w:r>
+        <w:t>using .</w:t>
+      </w:r>
+      <w:proofErr w:type="spellStart"/>
+      <w:r>
+        <w:t>eslintrc</w:t>
+      </w:r>
+      <w:proofErr w:type="gramEnd"/>
+      <w:r>
+        <w:t>.json</w:t>
+      </w:r>
+      <w:proofErr w:type="spellEnd"/>
+      <w:r>
+        <w:t>. However, NPM pulled the latest version (</w:t>
+      </w:r>
+      <w:proofErr w:type="spellStart"/>
+      <w:r>
+        <w:t>ESLint</w:t>
+      </w:r>
+      <w:proofErr w:type="spellEnd"/>
+      <w:r>
+        <w:t xml:space="preserve"> v10), which completely dropped support for the legacy JSON configuration system in </w:t>
+      </w:r>
+      <w:proofErr w:type="spellStart"/>
+      <w:r>
+        <w:t>favor</w:t>
+      </w:r>
+      <w:proofErr w:type="spellEnd"/>
+      <w:r>
+        <w:t xml:space="preserve"> of the new modular "Flat Config" system.</w:t>
+      </w:r>
+    </w:p>
+    <w:p>
+      <w:r>
+        <w:t xml:space="preserve"> * Resolution: Deleted the legacy JSON file and authored a new </w:t>
+      </w:r>
+      <w:proofErr w:type="spellStart"/>
+      <w:r>
+        <w:t>eslint.config.mjs</w:t>
+      </w:r>
+      <w:proofErr w:type="spellEnd"/>
+      <w:r>
+        <w:t xml:space="preserve"> file, utilizing modern ES Module import/export syntax to define the project's language options and rules.</w:t>
+      </w:r>
+    </w:p>
+    <w:p>
+      <w:r>
+        <w:t>Error Ticket #4: Missing Core Rules Dependency</w:t>
+      </w:r>
+    </w:p>
+    <w:p>
+      <w:r>
+        <w:t xml:space="preserve"> * Symptom: Terminal threw Error [ERR_MODULE_NOT_FOUND]: Cannot find package '@</w:t>
+      </w:r>
+      <w:proofErr w:type="spellStart"/>
+      <w:r>
+        <w:t>eslint</w:t>
+      </w:r>
+      <w:proofErr w:type="spellEnd"/>
+      <w:r>
+        <w:t>/</w:t>
+      </w:r>
+      <w:proofErr w:type="spellStart"/>
+      <w:r>
+        <w:t>js'</w:t>
+      </w:r>
+      <w:proofErr w:type="spellEnd"/>
+      <w:r>
+        <w:t xml:space="preserve"> imported from </w:t>
+      </w:r>
+      <w:proofErr w:type="spellStart"/>
+      <w:r>
+        <w:t>eslint.config.mjs</w:t>
+      </w:r>
+      <w:proofErr w:type="spellEnd"/>
+      <w:r>
+        <w:t>.</w:t>
+      </w:r>
+    </w:p>
+    <w:p>
+      <w:r>
+        <w:t xml:space="preserve"> * Root Cause Analysis: In the transition to the new Flat Config system, </w:t>
+      </w:r>
+      <w:proofErr w:type="spellStart"/>
+      <w:r>
+        <w:t>ESLint</w:t>
+      </w:r>
+      <w:proofErr w:type="spellEnd"/>
+      <w:r>
+        <w:t xml:space="preserve"> decoupled its core JavaScript recommended rules into a separate, standalone package. Our config file was trying to import it, but it hadn't been downloaded to our </w:t>
+      </w:r>
+      <w:proofErr w:type="spellStart"/>
+      <w:r>
+        <w:t>node_modules</w:t>
+      </w:r>
+      <w:proofErr w:type="spellEnd"/>
+      <w:r>
+        <w:t>.</w:t>
+      </w:r>
+    </w:p>
+    <w:p>
+      <w:r>
+        <w:t xml:space="preserve"> * Resolution: Executed </w:t>
+      </w:r>
+      <w:proofErr w:type="spellStart"/>
+      <w:r>
+        <w:t>npm</w:t>
+      </w:r>
+      <w:proofErr w:type="spellEnd"/>
+      <w:r>
+        <w:t xml:space="preserve"> install -D @eslint/js at the root level to provide the necessary dependency, successfully turning the CI pipeline green.</w:t>
+      </w:r>
+    </w:p>
+    <w:p>
+      <w:r>
+        <w:t>You now have a professional, automated DevOps pipeline.</w:t>
+      </w:r>
+    </w:p>
+    <w:p>
+      <w:r>
+        <w:t>Next weekend, we will dive into Week 3: The Database Schema and Authentication. We will build the actual data models in Mongoose and set up secure user registration.</w:t>
+      </w:r>
+    </w:p>
+    <w:p>
+      <w:r>
+        <w:t>Would you like me to outline the Week 3 prep plan, or are we signing off for today?</w:t>
+      </w:r>
+    </w:p>
+    <w:p/>
+    <w:p/>
+    <w:p/>
+    <w:p/>
+    <w:p/>
+    <w:p/>
+    <w:p/>
+    <w:p/>
+    <w:p/>
+    <w:p>
+      <w:r>
+        <w:lastRenderedPageBreak/>
+        <w:t xml:space="preserve">Here is the fully updated </w:t>
+      </w:r>
+      <w:r>
+        <w:rPr>
+          <w:b/>
+          <w:bCs/>
+        </w:rPr>
+        <w:t>Engineering Progress Report</w:t>
+      </w:r>
+      <w:r>
+        <w:t xml:space="preserve"> for Week 3. I have added a </w:t>
+      </w:r>
+      <w:proofErr w:type="gramStart"/>
+      <w:r>
+        <w:t>brand new</w:t>
+      </w:r>
+      <w:proofErr w:type="gramEnd"/>
+      <w:r>
+        <w:t xml:space="preserve"> section called </w:t>
+      </w:r>
+      <w:r>
+        <w:rPr>
+          <w:b/>
+          <w:bCs/>
+        </w:rPr>
+        <w:t>CLI Execution Log (Command Reference)</w:t>
+      </w:r>
+      <w:r>
+        <w:t xml:space="preserve"> that breaks down exactly what every terminal command did and the engineering logic behind it.</w:t>
+      </w:r>
+    </w:p>
+    <w:p>
+      <w:r>
+        <w:t>You can replace your Week 3 section in PROGRESS.md with this complete version:</w:t>
+      </w:r>
+    </w:p>
+    <w:p>
+      <w:r>
+        <w:pict w14:anchorId="530CCA03">
+          <v:rect id="_x0000_i1025" style="width:0;height:1.5pt" o:hralign="center" o:hrstd="t" o:hrnoshade="t" o:hr="t" fillcolor="gray" stroked="f"/>
+        </w:pict>
+      </w:r>
+    </w:p>
+    <w:p>
+      <w:pPr>
+        <w:rPr>
+          <w:b/>
+          <w:bCs/>
+        </w:rPr>
+      </w:pPr>
+      <w:r>
+        <w:rPr>
+          <w:rFonts w:ascii="Segoe UI Emoji" w:hAnsi="Segoe UI Emoji" w:cs="Segoe UI Emoji"/>
+          <w:b/>
+          <w:bCs/>
+        </w:rPr>
+        <w:t>📝</w:t>
+      </w:r>
+      <w:r>
+        <w:rPr>
+          <w:b/>
+          <w:bCs/>
+        </w:rPr>
+        <w:t xml:space="preserve"> Engineering Log: Week 3</w:t>
+      </w:r>
+    </w:p>
+    <w:p>
+      <w:r>
+        <w:rPr>
+          <w:b/>
+          <w:bCs/>
+        </w:rPr>
+        <w:t>Project:</w:t>
+      </w:r>
+      <w:r>
+        <w:t xml:space="preserve"> Nexus Orchestrator (Enterprise Edition - JS)</w:t>
+      </w:r>
+    </w:p>
+    <w:p>
+      <w:r>
+        <w:rPr>
+          <w:b/>
+          <w:bCs/>
+        </w:rPr>
+        <w:t>Phase:</w:t>
+      </w:r>
+      <w:r>
+        <w:t xml:space="preserve"> 3 - Database Schema &amp; Authentication</w:t>
+      </w:r>
+    </w:p>
+    <w:p>
+      <w:r>
+        <w:rPr>
+          <w:b/>
+          <w:bCs/>
+        </w:rPr>
+        <w:t>Status:</w:t>
+      </w:r>
+      <w:r>
+        <w:t xml:space="preserve"> </w:t>
+      </w:r>
+      <w:r>
+        <w:rPr>
+          <w:rFonts w:ascii="Segoe UI Emoji" w:hAnsi="Segoe UI Emoji" w:cs="Segoe UI Emoji"/>
+        </w:rPr>
+        <w:t>✅</w:t>
+      </w:r>
+      <w:r>
+        <w:t xml:space="preserve"> Completed</w:t>
+      </w:r>
+    </w:p>
+    <w:p>
+      <w:pPr>
+        <w:rPr>
+          <w:b/>
+          <w:bCs/>
+        </w:rPr>
+      </w:pPr>
+      <w:r>
+        <w:rPr>
+          <w:rFonts w:ascii="Segoe UI Emoji" w:hAnsi="Segoe UI Emoji" w:cs="Segoe UI Emoji"/>
+          <w:b/>
+          <w:bCs/>
+        </w:rPr>
+        <w:t>🛠️</w:t>
+      </w:r>
+      <w:r>
+        <w:rPr>
+          <w:b/>
+          <w:bCs/>
+        </w:rPr>
+        <w:t xml:space="preserve"> 1. What Was Accomplished (The Execution)</w:t>
+      </w:r>
+    </w:p>
+    <w:p>
+      <w:pPr>
+        <w:numPr>
+          <w:ilvl w:val="0"/>
+          <w:numId w:val="1"/>
+        </w:numPr>
+      </w:pPr>
+      <w:r>
+        <w:rPr>
+          <w:b/>
+          <w:bCs/>
+        </w:rPr>
+        <w:t>Security Dependency Management:</w:t>
+      </w:r>
+      <w:r>
+        <w:t xml:space="preserve"> Installed </w:t>
+      </w:r>
+      <w:proofErr w:type="spellStart"/>
+      <w:r>
+        <w:t>bcryptjs</w:t>
+      </w:r>
+      <w:proofErr w:type="spellEnd"/>
+      <w:r>
+        <w:t xml:space="preserve"> for cryptographic password hashing and </w:t>
+      </w:r>
+      <w:proofErr w:type="spellStart"/>
+      <w:r>
+        <w:t>jsonwebtoken</w:t>
+      </w:r>
+      <w:proofErr w:type="spellEnd"/>
+      <w:r>
+        <w:t xml:space="preserve"> (JWT) for stateless user authentication.</w:t>
+      </w:r>
+    </w:p>
+    <w:p>
+      <w:pPr>
+        <w:numPr>
+          <w:ilvl w:val="0"/>
+          <w:numId w:val="1"/>
+        </w:numPr>
+      </w:pPr>
+      <w:r>
+        <w:rPr>
+          <w:b/>
+          <w:bCs/>
+        </w:rPr>
+        <w:t>Environment Configuration:</w:t>
+      </w:r>
+      <w:r>
+        <w:t xml:space="preserve"> Implemented a secure .env file to manage sensitive credentials, including the MongoDB Atlas connection string and the JWT secret key.</w:t>
+      </w:r>
+    </w:p>
+    <w:p>
+      <w:pPr>
+        <w:numPr>
+          <w:ilvl w:val="0"/>
+          <w:numId w:val="1"/>
+        </w:numPr>
+      </w:pPr>
+      <w:r>
+        <w:rPr>
+          <w:b/>
+          <w:bCs/>
+        </w:rPr>
+        <w:t>Cloud Database Integration:</w:t>
+      </w:r>
+      <w:r>
+        <w:t xml:space="preserve"> Engineered a robust MongoDB connection module (config/db.js) utilizing Mongoose, complete with a "fail-fast" mechanism that terminates the server process (</w:t>
+      </w:r>
+      <w:proofErr w:type="spellStart"/>
+      <w:proofErr w:type="gramStart"/>
+      <w:r>
+        <w:t>process.exit</w:t>
+      </w:r>
+      <w:proofErr w:type="spellEnd"/>
+      <w:proofErr w:type="gramEnd"/>
+      <w:r>
+        <w:t>(1)) if the database connection fails.</w:t>
+      </w:r>
+    </w:p>
+    <w:p>
+      <w:pPr>
+        <w:numPr>
+          <w:ilvl w:val="0"/>
+          <w:numId w:val="1"/>
+        </w:numPr>
+      </w:pPr>
+      <w:r>
+        <w:rPr>
+          <w:b/>
+          <w:bCs/>
+        </w:rPr>
+        <w:t xml:space="preserve">Data </w:t>
+      </w:r>
+      <w:proofErr w:type="spellStart"/>
+      <w:r>
+        <w:rPr>
+          <w:b/>
+          <w:bCs/>
+        </w:rPr>
+        <w:t>Modeling</w:t>
+      </w:r>
+      <w:proofErr w:type="spellEnd"/>
+      <w:r>
+        <w:rPr>
+          <w:b/>
+          <w:bCs/>
+        </w:rPr>
+        <w:t>:</w:t>
+      </w:r>
+      <w:r>
+        <w:t xml:space="preserve"> Designed the User schema (models/User.js) with Mongoose.</w:t>
+      </w:r>
+    </w:p>
+    <w:p>
+      <w:pPr>
+        <w:numPr>
+          <w:ilvl w:val="0"/>
+          <w:numId w:val="1"/>
+        </w:numPr>
+      </w:pPr>
+      <w:r>
+        <w:rPr>
+          <w:b/>
+          <w:bCs/>
+        </w:rPr>
+        <w:t>Cryptographic Hooks:</w:t>
+      </w:r>
+      <w:r>
+        <w:t xml:space="preserve"> Implemented a Mongoose pre('save') middleware hook to automatically salt and hash user passwords before they are persisted to the database.</w:t>
+      </w:r>
+    </w:p>
+    <w:p>
+      <w:pPr>
+        <w:numPr>
+          <w:ilvl w:val="0"/>
+          <w:numId w:val="1"/>
+        </w:numPr>
+      </w:pPr>
+      <w:r>
+        <w:rPr>
+          <w:b/>
+          <w:bCs/>
+        </w:rPr>
+        <w:t>Authentication API:</w:t>
+      </w:r>
+      <w:r>
+        <w:t xml:space="preserve"> Built the Auth Controller (controllers/authController.js) featuring asynchronous </w:t>
+      </w:r>
+      <w:proofErr w:type="spellStart"/>
+      <w:r>
+        <w:t>registerUser</w:t>
+      </w:r>
+      <w:proofErr w:type="spellEnd"/>
+      <w:r>
+        <w:t xml:space="preserve"> and </w:t>
+      </w:r>
+      <w:proofErr w:type="spellStart"/>
+      <w:r>
+        <w:t>loginUser</w:t>
+      </w:r>
+      <w:proofErr w:type="spellEnd"/>
+      <w:r>
+        <w:t xml:space="preserve"> methods, handling duplicate user validation and secure token generation.</w:t>
+      </w:r>
+    </w:p>
+    <w:p>
+      <w:pPr>
+        <w:numPr>
+          <w:ilvl w:val="0"/>
+          <w:numId w:val="1"/>
+        </w:numPr>
+      </w:pPr>
+      <w:r>
+        <w:rPr>
+          <w:b/>
+          <w:bCs/>
+        </w:rPr>
+        <w:t>Route Wiring:</w:t>
+      </w:r>
+      <w:r>
+        <w:t xml:space="preserve"> Connected the authentication routes (routes/authRoutes.js) to the main Express API Gateway (server.js).</w:t>
+      </w:r>
+    </w:p>
+    <w:p>
+      <w:r>
+        <w:pict w14:anchorId="2CAEA8A3">
+          <v:rect id="_x0000_i1026" style="width:0;height:1.5pt" o:hralign="center" o:hrstd="t" o:hrnoshade="t" o:hr="t" fillcolor="gray" stroked="f"/>
+        </w:pict>
+      </w:r>
+    </w:p>
+    <w:p>
+      <w:pPr>
+        <w:rPr>
+          <w:b/>
+          <w:bCs/>
+        </w:rPr>
+      </w:pPr>
+      <w:r>
+        <w:rPr>
+          <w:rFonts w:ascii="Segoe UI Emoji" w:hAnsi="Segoe UI Emoji" w:cs="Segoe UI Emoji"/>
+          <w:b/>
+          <w:bCs/>
+        </w:rPr>
+        <w:t>💻</w:t>
+      </w:r>
+      <w:r>
+        <w:rPr>
+          <w:b/>
+          <w:bCs/>
+        </w:rPr>
+        <w:t xml:space="preserve"> 2. CLI Execution Log (Command Reference)</w:t>
+      </w:r>
+    </w:p>
+    <w:p>
+      <w:r>
+        <w:t>As a DevOps and Backend Engineer, the terminal is the primary tool. Here is the exact breakdown of the commands executed this week and their underlying mechanics:</w:t>
+      </w:r>
+    </w:p>
+    <w:tbl>
+      <w:tblPr>
+        <w:tblW w:w="0" w:type="auto"/>
+        <w:tblCellSpacing w:w="15" w:type="dxa"/>
+        <w:tblCellMar>
+          <w:left w:w="0" w:type="dxa"/>
+          <w:right w:w="0" w:type="dxa"/>
+        </w:tblCellMar>
+        <w:tblLook w:val="04A0" w:firstRow="1" w:lastRow="0" w:firstColumn="1" w:lastColumn="0" w:noHBand="0" w:noVBand="1"/>
+      </w:tblPr>
+      <w:tblGrid>
+        <w:gridCol w:w="3299"/>
+        <w:gridCol w:w="5711"/>
+      </w:tblGrid>
+      <w:tr>
+        <w:trPr>
+          <w:tblHeader/>
+          <w:tblCellSpacing w:w="15" w:type="dxa"/>
+        </w:trPr>
+        <w:tc>
+          <w:tcPr>
+            <w:tcW w:w="0" w:type="auto"/>
+            <w:tcBorders>
+              <w:top w:val="single" w:sz="6" w:space="0" w:color="auto"/>
+              <w:left w:val="single" w:sz="6" w:space="0" w:color="auto"/>
+              <w:bottom w:val="single" w:sz="6" w:space="0" w:color="auto"/>
+              <w:right w:val="single" w:sz="6" w:space="0" w:color="auto"/>
+            </w:tcBorders>
+            <w:tcMar>
+              <w:top w:w="240" w:type="dxa"/>
+              <w:left w:w="0" w:type="dxa"/>
+              <w:bottom w:w="240" w:type="dxa"/>
+              <w:right w:w="180" w:type="dxa"/>
+            </w:tcMar>
+            <w:vAlign w:val="center"/>
+            <w:hideMark/>
+          </w:tcPr>
+          <w:p>
+            <w:r>
+              <w:rPr>
+                <w:b/>
+                <w:bCs/>
+              </w:rPr>
+              <w:t>Command Executed</w:t>
+            </w:r>
+          </w:p>
+        </w:tc>
+        <w:tc>
+          <w:tcPr>
+            <w:tcW w:w="0" w:type="auto"/>
+            <w:tcBorders>
+              <w:top w:val="single" w:sz="6" w:space="0" w:color="auto"/>
+              <w:left w:val="single" w:sz="6" w:space="0" w:color="auto"/>
+              <w:bottom w:val="single" w:sz="6" w:space="0" w:color="auto"/>
+              <w:right w:val="single" w:sz="6" w:space="0" w:color="auto"/>
+            </w:tcBorders>
+            <w:tcMar>
+              <w:top w:w="240" w:type="dxa"/>
+              <w:left w:w="0" w:type="dxa"/>
+              <w:bottom w:w="240" w:type="dxa"/>
+              <w:right w:w="0" w:type="dxa"/>
+            </w:tcMar>
+            <w:vAlign w:val="center"/>
+            <w:hideMark/>
+          </w:tcPr>
+          <w:p>
+            <w:r>
+              <w:rPr>
+                <w:b/>
+                <w:bCs/>
+              </w:rPr>
+              <w:t>How it Works &amp; Engineering Purpose</w:t>
+            </w:r>
+          </w:p>
+        </w:tc>
+      </w:tr>
+      <w:tr>
+        <w:trPr>
+          <w:tblCellSpacing w:w="15" w:type="dxa"/>
+        </w:trPr>
+        <w:tc>
+          <w:tcPr>
+            <w:tcW w:w="0" w:type="auto"/>
+            <w:tcBorders>
+              <w:top w:val="single" w:sz="6" w:space="0" w:color="auto"/>
+              <w:left w:val="single" w:sz="6" w:space="0" w:color="auto"/>
+              <w:bottom w:val="single" w:sz="6" w:space="0" w:color="auto"/>
+              <w:right w:val="single" w:sz="6" w:space="0" w:color="auto"/>
+            </w:tcBorders>
+            <w:tcMar>
+              <w:top w:w="240" w:type="dxa"/>
+              <w:left w:w="0" w:type="dxa"/>
+              <w:bottom w:w="240" w:type="dxa"/>
+              <w:right w:w="180" w:type="dxa"/>
+            </w:tcMar>
+            <w:vAlign w:val="center"/>
+            <w:hideMark/>
+          </w:tcPr>
+          <w:p>
+            <w:proofErr w:type="spellStart"/>
+            <w:r>
+              <w:t>npm</w:t>
+            </w:r>
+            <w:proofErr w:type="spellEnd"/>
+            <w:r>
+              <w:t xml:space="preserve"> install </w:t>
+            </w:r>
+            <w:proofErr w:type="spellStart"/>
+            <w:r>
+              <w:t>bcryptjs</w:t>
+            </w:r>
+            <w:proofErr w:type="spellEnd"/>
+            <w:r>
+              <w:t xml:space="preserve"> </w:t>
+            </w:r>
+            <w:proofErr w:type="spellStart"/>
+            <w:r>
+              <w:t>jsonwebtoken</w:t>
+            </w:r>
+            <w:proofErr w:type="spellEnd"/>
+            <w:r>
+              <w:t xml:space="preserve"> --</w:t>
+            </w:r>
+            <w:r>
+              <w:lastRenderedPageBreak/>
+              <w:t>workspace=packages/control-plane</w:t>
+            </w:r>
+          </w:p>
+        </w:tc>
+        <w:tc>
+          <w:tcPr>
+            <w:tcW w:w="0" w:type="auto"/>
+            <w:tcBorders>
+              <w:top w:val="single" w:sz="6" w:space="0" w:color="auto"/>
+              <w:left w:val="single" w:sz="6" w:space="0" w:color="auto"/>
+              <w:bottom w:val="single" w:sz="6" w:space="0" w:color="auto"/>
+              <w:right w:val="single" w:sz="6" w:space="0" w:color="auto"/>
+            </w:tcBorders>
+            <w:tcMar>
+              <w:top w:w="240" w:type="dxa"/>
+              <w:left w:w="0" w:type="dxa"/>
+              <w:bottom w:w="240" w:type="dxa"/>
+              <w:right w:w="0" w:type="dxa"/>
+            </w:tcMar>
+            <w:vAlign w:val="center"/>
+            <w:hideMark/>
+          </w:tcPr>
+          <w:p>
+            <w:r>
+              <w:rPr>
+                <w:b/>
+                <w:bCs/>
+              </w:rPr>
+              <w:lastRenderedPageBreak/>
+              <w:t>Targeted Dependency Injection:</w:t>
+            </w:r>
+            <w:r>
+              <w:t xml:space="preserve"> </w:t>
+            </w:r>
+            <w:proofErr w:type="spellStart"/>
+            <w:r>
+              <w:t>npm</w:t>
+            </w:r>
+            <w:proofErr w:type="spellEnd"/>
+            <w:r>
+              <w:t xml:space="preserve"> install fetches the libraries from the registry. The critical part is the --workspace= flag. In a </w:t>
+            </w:r>
+            <w:proofErr w:type="spellStart"/>
+            <w:r>
+              <w:t>Monorepo</w:t>
+            </w:r>
+            <w:proofErr w:type="spellEnd"/>
+            <w:r>
+              <w:t xml:space="preserve">, we don't want backend security tools </w:t>
+            </w:r>
+            <w:r>
+              <w:lastRenderedPageBreak/>
+              <w:t xml:space="preserve">polluting the frontend dashboard. This flag tells NPM to add these libraries </w:t>
+            </w:r>
+            <w:r>
+              <w:rPr>
+                <w:i/>
+                <w:iCs/>
+              </w:rPr>
+              <w:t>specifically</w:t>
+            </w:r>
+            <w:r>
+              <w:t xml:space="preserve"> to the control-plane's </w:t>
+            </w:r>
+            <w:proofErr w:type="spellStart"/>
+            <w:proofErr w:type="gramStart"/>
+            <w:r>
+              <w:t>package.json</w:t>
+            </w:r>
+            <w:proofErr w:type="spellEnd"/>
+            <w:proofErr w:type="gramEnd"/>
+            <w:r>
+              <w:t xml:space="preserve">, while still hoisting the actual files to the root </w:t>
+            </w:r>
+            <w:proofErr w:type="spellStart"/>
+            <w:r>
+              <w:t>node_modules</w:t>
+            </w:r>
+            <w:proofErr w:type="spellEnd"/>
+            <w:r>
+              <w:t xml:space="preserve"> folder to optimize disk space.</w:t>
+            </w:r>
+          </w:p>
+        </w:tc>
+      </w:tr>
+      <w:tr>
+        <w:trPr>
+          <w:tblCellSpacing w:w="15" w:type="dxa"/>
+        </w:trPr>
+        <w:tc>
+          <w:tcPr>
+            <w:tcW w:w="0" w:type="auto"/>
+            <w:tcBorders>
+              <w:top w:val="single" w:sz="6" w:space="0" w:color="auto"/>
+              <w:left w:val="single" w:sz="6" w:space="0" w:color="auto"/>
+              <w:bottom w:val="single" w:sz="6" w:space="0" w:color="auto"/>
+              <w:right w:val="single" w:sz="6" w:space="0" w:color="auto"/>
+            </w:tcBorders>
+            <w:tcMar>
+              <w:top w:w="240" w:type="dxa"/>
+              <w:left w:w="0" w:type="dxa"/>
+              <w:bottom w:w="240" w:type="dxa"/>
+              <w:right w:w="180" w:type="dxa"/>
+            </w:tcMar>
+            <w:vAlign w:val="center"/>
+            <w:hideMark/>
+          </w:tcPr>
+          <w:p>
+            <w:proofErr w:type="spellStart"/>
+            <w:r>
+              <w:lastRenderedPageBreak/>
+              <w:t>npm</w:t>
+            </w:r>
+            <w:proofErr w:type="spellEnd"/>
+            <w:r>
+              <w:t xml:space="preserve"> run </w:t>
+            </w:r>
+            <w:proofErr w:type="spellStart"/>
+            <w:proofErr w:type="gramStart"/>
+            <w:r>
+              <w:t>start:brain</w:t>
+            </w:r>
+            <w:proofErr w:type="spellEnd"/>
+            <w:proofErr w:type="gramEnd"/>
+          </w:p>
+        </w:tc>
+        <w:tc>
+          <w:tcPr>
+            <w:tcW w:w="0" w:type="auto"/>
+            <w:tcBorders>
+              <w:top w:val="single" w:sz="6" w:space="0" w:color="auto"/>
+              <w:left w:val="single" w:sz="6" w:space="0" w:color="auto"/>
+              <w:bottom w:val="single" w:sz="6" w:space="0" w:color="auto"/>
+              <w:right w:val="single" w:sz="6" w:space="0" w:color="auto"/>
+            </w:tcBorders>
+            <w:tcMar>
+              <w:top w:w="240" w:type="dxa"/>
+              <w:left w:w="0" w:type="dxa"/>
+              <w:bottom w:w="240" w:type="dxa"/>
+              <w:right w:w="0" w:type="dxa"/>
+            </w:tcMar>
+            <w:vAlign w:val="center"/>
+            <w:hideMark/>
+          </w:tcPr>
+          <w:p>
+            <w:r>
+              <w:rPr>
+                <w:b/>
+                <w:bCs/>
+              </w:rPr>
+              <w:t>Workspace Script Execution:</w:t>
+            </w:r>
+            <w:r>
+              <w:t xml:space="preserve"> This runs the custom script defined in our root </w:t>
+            </w:r>
+            <w:proofErr w:type="spellStart"/>
+            <w:proofErr w:type="gramStart"/>
+            <w:r>
+              <w:t>package.json</w:t>
+            </w:r>
+            <w:proofErr w:type="spellEnd"/>
+            <w:proofErr w:type="gramEnd"/>
+            <w:r>
+              <w:t xml:space="preserve">. It translates to </w:t>
+            </w:r>
+            <w:proofErr w:type="spellStart"/>
+            <w:r>
+              <w:t>npm</w:t>
+            </w:r>
+            <w:proofErr w:type="spellEnd"/>
+            <w:r>
+              <w:t xml:space="preserve"> run start --workspace=packages/control-plane. NPM securely navigates into the Brain's workspace and executes its specific start command (node </w:t>
+            </w:r>
+            <w:proofErr w:type="spellStart"/>
+            <w:r>
+              <w:t>src</w:t>
+            </w:r>
+            <w:proofErr w:type="spellEnd"/>
+            <w:r>
+              <w:t>/server.js), booting up the Express server and triggering the MongoDB connection sequence.</w:t>
+            </w:r>
+          </w:p>
+        </w:tc>
+      </w:tr>
+      <w:tr>
+        <w:trPr>
+          <w:tblCellSpacing w:w="15" w:type="dxa"/>
+        </w:trPr>
+        <w:tc>
+          <w:tcPr>
+            <w:tcW w:w="0" w:type="auto"/>
+            <w:tcBorders>
+              <w:top w:val="single" w:sz="6" w:space="0" w:color="auto"/>
+              <w:left w:val="single" w:sz="6" w:space="0" w:color="auto"/>
+              <w:bottom w:val="single" w:sz="6" w:space="0" w:color="auto"/>
+              <w:right w:val="single" w:sz="6" w:space="0" w:color="auto"/>
+            </w:tcBorders>
+            <w:tcMar>
+              <w:top w:w="240" w:type="dxa"/>
+              <w:left w:w="0" w:type="dxa"/>
+              <w:bottom w:w="240" w:type="dxa"/>
+              <w:right w:w="180" w:type="dxa"/>
+            </w:tcMar>
+            <w:vAlign w:val="center"/>
+            <w:hideMark/>
+          </w:tcPr>
+          <w:p>
+            <w:r>
+              <w:t xml:space="preserve">git </w:t>
+            </w:r>
+            <w:proofErr w:type="gramStart"/>
+            <w:r>
+              <w:t>add .</w:t>
+            </w:r>
+            <w:proofErr w:type="gramEnd"/>
+          </w:p>
+        </w:tc>
+        <w:tc>
+          <w:tcPr>
+            <w:tcW w:w="0" w:type="auto"/>
+            <w:tcBorders>
+              <w:top w:val="single" w:sz="6" w:space="0" w:color="auto"/>
+              <w:left w:val="single" w:sz="6" w:space="0" w:color="auto"/>
+              <w:bottom w:val="single" w:sz="6" w:space="0" w:color="auto"/>
+              <w:right w:val="single" w:sz="6" w:space="0" w:color="auto"/>
+            </w:tcBorders>
+            <w:tcMar>
+              <w:top w:w="240" w:type="dxa"/>
+              <w:left w:w="0" w:type="dxa"/>
+              <w:bottom w:w="240" w:type="dxa"/>
+              <w:right w:w="0" w:type="dxa"/>
+            </w:tcMar>
+            <w:vAlign w:val="center"/>
+            <w:hideMark/>
+          </w:tcPr>
+          <w:p>
+            <w:r>
+              <w:rPr>
+                <w:b/>
+                <w:bCs/>
+              </w:rPr>
+              <w:t>Staging:</w:t>
+            </w:r>
+            <w:r>
+              <w:t xml:space="preserve"> </w:t>
+            </w:r>
+            <w:proofErr w:type="gramStart"/>
+            <w:r>
+              <w:t>The .</w:t>
+            </w:r>
+            <w:proofErr w:type="gramEnd"/>
+            <w:r>
+              <w:t xml:space="preserve"> signifies "all". This tells Git to scan the entire directory tree, find all modified, deleted, or newly created files (like our new db.js and authController.js), and place them in the "Staging Area" in preparation for a snapshot.</w:t>
+            </w:r>
+          </w:p>
+        </w:tc>
+      </w:tr>
+      <w:tr>
+        <w:trPr>
+          <w:tblCellSpacing w:w="15" w:type="dxa"/>
+        </w:trPr>
+        <w:tc>
+          <w:tcPr>
+            <w:tcW w:w="0" w:type="auto"/>
+            <w:tcBorders>
+              <w:top w:val="single" w:sz="6" w:space="0" w:color="auto"/>
+              <w:left w:val="single" w:sz="6" w:space="0" w:color="auto"/>
+              <w:bottom w:val="single" w:sz="6" w:space="0" w:color="auto"/>
+              <w:right w:val="single" w:sz="6" w:space="0" w:color="auto"/>
+            </w:tcBorders>
+            <w:tcMar>
+              <w:top w:w="240" w:type="dxa"/>
+              <w:left w:w="0" w:type="dxa"/>
+              <w:bottom w:w="240" w:type="dxa"/>
+              <w:right w:w="180" w:type="dxa"/>
+            </w:tcMar>
+            <w:vAlign w:val="center"/>
+            <w:hideMark/>
+          </w:tcPr>
+          <w:p>
+            <w:r>
+              <w:t xml:space="preserve">git commit -m "feat: integrate </w:t>
+            </w:r>
+            <w:proofErr w:type="spellStart"/>
+            <w:r>
+              <w:t>mongodb</w:t>
+            </w:r>
+            <w:proofErr w:type="spellEnd"/>
+            <w:r>
+              <w:t>..."</w:t>
+            </w:r>
+          </w:p>
+        </w:tc>
+        <w:tc>
+          <w:tcPr>
+            <w:tcW w:w="0" w:type="auto"/>
+            <w:tcBorders>
+              <w:top w:val="single" w:sz="6" w:space="0" w:color="auto"/>
+              <w:left w:val="single" w:sz="6" w:space="0" w:color="auto"/>
+              <w:bottom w:val="single" w:sz="6" w:space="0" w:color="auto"/>
+              <w:right w:val="single" w:sz="6" w:space="0" w:color="auto"/>
+            </w:tcBorders>
+            <w:tcMar>
+              <w:top w:w="240" w:type="dxa"/>
+              <w:left w:w="0" w:type="dxa"/>
+              <w:bottom w:w="240" w:type="dxa"/>
+              <w:right w:w="0" w:type="dxa"/>
+            </w:tcMar>
+            <w:vAlign w:val="center"/>
+            <w:hideMark/>
+          </w:tcPr>
+          <w:p>
+            <w:r>
+              <w:rPr>
+                <w:b/>
+                <w:bCs/>
+              </w:rPr>
+              <w:t>Snapshot Creation:</w:t>
+            </w:r>
+            <w:r>
+              <w:t xml:space="preserve"> Takes the staged files and permanently writes them to the local Git history ledger. The -m flag passes the commit message. We use the feat: prefix (Conventional Commits specification) to clearly signal to other developers and release automation tools that this code introduces a new feature.</w:t>
+            </w:r>
+          </w:p>
+        </w:tc>
+      </w:tr>
+      <w:tr>
+        <w:trPr>
+          <w:tblCellSpacing w:w="15" w:type="dxa"/>
+        </w:trPr>
+        <w:tc>
+          <w:tcPr>
+            <w:tcW w:w="0" w:type="auto"/>
+            <w:tcBorders>
+              <w:top w:val="single" w:sz="6" w:space="0" w:color="auto"/>
+              <w:left w:val="single" w:sz="6" w:space="0" w:color="auto"/>
+              <w:bottom w:val="single" w:sz="6" w:space="0" w:color="auto"/>
+              <w:right w:val="single" w:sz="6" w:space="0" w:color="auto"/>
+            </w:tcBorders>
+            <w:tcMar>
+              <w:top w:w="240" w:type="dxa"/>
+              <w:left w:w="0" w:type="dxa"/>
+              <w:bottom w:w="240" w:type="dxa"/>
+              <w:right w:w="180" w:type="dxa"/>
+            </w:tcMar>
+            <w:vAlign w:val="center"/>
+            <w:hideMark/>
+          </w:tcPr>
+          <w:p>
+            <w:r>
+              <w:t>git push origin main</w:t>
+            </w:r>
+          </w:p>
+        </w:tc>
+        <w:tc>
+          <w:tcPr>
+            <w:tcW w:w="0" w:type="auto"/>
+            <w:tcBorders>
+              <w:top w:val="single" w:sz="6" w:space="0" w:color="auto"/>
+              <w:left w:val="single" w:sz="6" w:space="0" w:color="auto"/>
+              <w:bottom w:val="single" w:sz="6" w:space="0" w:color="auto"/>
+              <w:right w:val="single" w:sz="6" w:space="0" w:color="auto"/>
+            </w:tcBorders>
+            <w:tcMar>
+              <w:top w:w="240" w:type="dxa"/>
+              <w:left w:w="0" w:type="dxa"/>
+              <w:bottom w:w="240" w:type="dxa"/>
+              <w:right w:w="0" w:type="dxa"/>
+            </w:tcMar>
+            <w:vAlign w:val="center"/>
+            <w:hideMark/>
+          </w:tcPr>
+          <w:p>
+            <w:r>
+              <w:rPr>
+                <w:b/>
+                <w:bCs/>
+              </w:rPr>
+              <w:t>Remote Synchronization:</w:t>
+            </w:r>
+            <w:r>
+              <w:t xml:space="preserve"> Uploads the local Git commits to the remote repository server (origin, which maps to GitHub) onto the main branch. This secures the code in the cloud and automatically triggers our GitHub Actions CI pipeline from Week 2.</w:t>
+            </w:r>
+          </w:p>
+        </w:tc>
+      </w:tr>
+    </w:tbl>
+    <w:p>
+      <w:r>
+        <w:pict w14:anchorId="43883CFF">
+          <v:rect id="_x0000_i1027" style="width:0;height:1.5pt" o:hralign="center" o:hrstd="t" o:hrnoshade="t" o:hr="t" fillcolor="gray" stroked="f"/>
+        </w:pict>
+      </w:r>
+    </w:p>
+    <w:p>
+      <w:pPr>
+        <w:rPr>
+          <w:b/>
+          <w:bCs/>
+        </w:rPr>
+      </w:pPr>
+      <w:r>
+        <w:rPr>
+          <w:rFonts w:ascii="Segoe UI Emoji" w:hAnsi="Segoe UI Emoji" w:cs="Segoe UI Emoji"/>
+          <w:b/>
+          <w:bCs/>
+        </w:rPr>
+        <w:t>🧠</w:t>
+      </w:r>
+      <w:r>
+        <w:rPr>
+          <w:b/>
+          <w:bCs/>
+        </w:rPr>
+        <w:t xml:space="preserve"> 3. Engineering Rationale (The "Why")</w:t>
+      </w:r>
+    </w:p>
+    <w:p>
+      <w:r>
+        <w:t>Building a secure entry point is the most critical phase of a cloud platform. If the authentication is weak, the entire cluster is compromised.</w:t>
+      </w:r>
+    </w:p>
+    <w:p>
+      <w:pPr>
+        <w:rPr>
+          <w:b/>
+          <w:bCs/>
+        </w:rPr>
+      </w:pPr>
+      <w:r>
+        <w:rPr>
+          <w:b/>
+          <w:bCs/>
+        </w:rPr>
+        <w:t xml:space="preserve">Why </w:t>
+      </w:r>
+      <w:proofErr w:type="spellStart"/>
+      <w:r>
+        <w:rPr>
+          <w:b/>
+          <w:bCs/>
+        </w:rPr>
+        <w:t>bcryptjs</w:t>
+      </w:r>
+      <w:proofErr w:type="spellEnd"/>
+      <w:r>
+        <w:rPr>
+          <w:b/>
+          <w:bCs/>
+        </w:rPr>
+        <w:t xml:space="preserve"> and Pre-Save Hooks?</w:t>
+      </w:r>
+    </w:p>
+    <w:p>
+      <w:r>
+        <w:lastRenderedPageBreak/>
+        <w:t xml:space="preserve">We </w:t>
+      </w:r>
+      <w:r>
+        <w:rPr>
+          <w:i/>
+          <w:iCs/>
+        </w:rPr>
+        <w:t>never</w:t>
+      </w:r>
+      <w:r>
+        <w:t xml:space="preserve"> store plain-text passwords in a database. If the database is breached, hackers would have everyone's passwords. By using </w:t>
+      </w:r>
+      <w:proofErr w:type="spellStart"/>
+      <w:r>
+        <w:t>bcryptjs</w:t>
+      </w:r>
+      <w:proofErr w:type="spellEnd"/>
+      <w:r>
+        <w:t>, we turn "password123" into an unrecognizable hash (e.g., $2a$10$Xyz...). We placed this logic inside a Mongoose pre('save') hook so that developers don't have to remember to hash the password manually every time they create a user; the database model enforces it automatically.</w:t>
+      </w:r>
+    </w:p>
+    <w:p>
+      <w:pPr>
+        <w:rPr>
+          <w:b/>
+          <w:bCs/>
+        </w:rPr>
+      </w:pPr>
+      <w:r>
+        <w:rPr>
+          <w:b/>
+          <w:bCs/>
+        </w:rPr>
+        <w:t>Why JSON Web Tokens (JWT)?</w:t>
+      </w:r>
+    </w:p>
+    <w:p>
+      <w:r>
+        <w:t xml:space="preserve">Traditional apps use "sessions" stored in the server's memory. But Nexus is a distributed cloud orchestrator. If the Control Plane restarts, or if we run multiple Control Planes behind a load balancer, memory-based sessions would break. JWTs are </w:t>
+      </w:r>
+      <w:r>
+        <w:rPr>
+          <w:b/>
+          <w:bCs/>
+        </w:rPr>
+        <w:t>stateless</w:t>
+      </w:r>
+      <w:r>
+        <w:t>. The server signs a cryptographic token and gives it to the user. The user presents this token on future requests, and the server can verify its mathematical signature without needing to look up a session in memory.</w:t>
+      </w:r>
+    </w:p>
+    <w:p>
+      <w:pPr>
+        <w:rPr>
+          <w:b/>
+          <w:bCs/>
+        </w:rPr>
+      </w:pPr>
+      <w:r>
+        <w:rPr>
+          <w:b/>
+          <w:bCs/>
+        </w:rPr>
+        <w:t>Why the "Fail-Fast" Database Connection?</w:t>
+      </w:r>
+    </w:p>
+    <w:p>
+      <w:r>
+        <w:t xml:space="preserve">In db.js, if the MongoDB connection fails, we call </w:t>
+      </w:r>
+      <w:proofErr w:type="spellStart"/>
+      <w:proofErr w:type="gramStart"/>
+      <w:r>
+        <w:t>process.exit</w:t>
+      </w:r>
+      <w:proofErr w:type="spellEnd"/>
+      <w:proofErr w:type="gramEnd"/>
+      <w:r>
+        <w:t xml:space="preserve">(1). Why crash the app intentionally? Because an API Gateway that cannot reach its database is a "zombie process." It's running, but it's useless. In a real DevOps environment (like Kubernetes or our future Docker setup), crashing the app tells the orchestrator: </w:t>
+      </w:r>
+      <w:r>
+        <w:rPr>
+          <w:i/>
+          <w:iCs/>
+        </w:rPr>
+        <w:t>"I am broken, please restart me."</w:t>
+      </w:r>
+    </w:p>
+    <w:p>
+      <w:r>
+        <w:pict w14:anchorId="5C98DCED">
+          <v:rect id="_x0000_i1028" style="width:0;height:1.5pt" o:hralign="center" o:hrstd="t" o:hrnoshade="t" o:hr="t" fillcolor="gray" stroked="f"/>
+        </w:pict>
+      </w:r>
+    </w:p>
+    <w:p>
+      <w:pPr>
+        <w:rPr>
+          <w:b/>
+          <w:bCs/>
+        </w:rPr>
+      </w:pPr>
+      <w:r>
+        <w:rPr>
+          <w:rFonts w:ascii="Segoe UI Emoji" w:hAnsi="Segoe UI Emoji" w:cs="Segoe UI Emoji"/>
+          <w:b/>
+          <w:bCs/>
+        </w:rPr>
+        <w:t>🐛</w:t>
+      </w:r>
+      <w:r>
+        <w:rPr>
+          <w:b/>
+          <w:bCs/>
+        </w:rPr>
+        <w:t xml:space="preserve"> 4. Tracks of Error &amp; Triage Log</w:t>
+      </w:r>
+    </w:p>
+    <w:p>
+      <w:pPr>
+        <w:rPr>
+          <w:b/>
+          <w:bCs/>
+        </w:rPr>
+      </w:pPr>
+      <w:r>
+        <w:rPr>
+          <w:b/>
+          <w:bCs/>
+        </w:rPr>
+        <w:t>Error Ticket #5: Controller Module Resolution Failure</w:t>
+      </w:r>
+    </w:p>
+    <w:p>
+      <w:pPr>
+        <w:numPr>
+          <w:ilvl w:val="0"/>
+          <w:numId w:val="2"/>
+        </w:numPr>
+      </w:pPr>
+      <w:r>
+        <w:rPr>
+          <w:b/>
+          <w:bCs/>
+        </w:rPr>
+        <w:t>Symptom:</w:t>
+      </w:r>
+      <w:r>
+        <w:t xml:space="preserve"> Terminal threw Error: Cannot find module </w:t>
+      </w:r>
+      <w:proofErr w:type="gramStart"/>
+      <w:r>
+        <w:t>'..</w:t>
+      </w:r>
+      <w:proofErr w:type="gramEnd"/>
+      <w:r>
+        <w:t>/controllers/</w:t>
+      </w:r>
+      <w:proofErr w:type="spellStart"/>
+      <w:r>
+        <w:t>authController</w:t>
+      </w:r>
+      <w:proofErr w:type="spellEnd"/>
+      <w:r>
+        <w:t>' at startup, halting the Express server initialization.</w:t>
+      </w:r>
+    </w:p>
+    <w:p>
+      <w:pPr>
+        <w:numPr>
+          <w:ilvl w:val="0"/>
+          <w:numId w:val="2"/>
+        </w:numPr>
+      </w:pPr>
+      <w:r>
+        <w:rPr>
+          <w:b/>
+          <w:bCs/>
+        </w:rPr>
+        <w:t>Root Cause Analysis:</w:t>
+      </w:r>
+      <w:r>
+        <w:t xml:space="preserve"> The routing module (authRoutes.js) attempted to import functions from the controller using relative pathing </w:t>
+      </w:r>
+      <w:proofErr w:type="gramStart"/>
+      <w:r>
+        <w:t>(..</w:t>
+      </w:r>
+      <w:proofErr w:type="gramEnd"/>
+      <w:r>
+        <w:t>/controllers/</w:t>
+      </w:r>
+      <w:proofErr w:type="spellStart"/>
+      <w:r>
+        <w:t>authController</w:t>
+      </w:r>
+      <w:proofErr w:type="spellEnd"/>
+      <w:r>
+        <w:t xml:space="preserve">). The Node.js module resolution algorithm failed because the target file was either misnamed (case-sensitivity), not saved to disk, or placed in an incorrect directory hierarchy outside of the </w:t>
+      </w:r>
+      <w:proofErr w:type="spellStart"/>
+      <w:r>
+        <w:t>src</w:t>
+      </w:r>
+      <w:proofErr w:type="spellEnd"/>
+      <w:r>
+        <w:t>/</w:t>
+      </w:r>
+      <w:proofErr w:type="gramStart"/>
+      <w:r>
+        <w:t>controllers</w:t>
+      </w:r>
+      <w:proofErr w:type="gramEnd"/>
+      <w:r>
+        <w:t>/ folder.</w:t>
+      </w:r>
+    </w:p>
+    <w:p>
+      <w:pPr>
+        <w:numPr>
+          <w:ilvl w:val="0"/>
+          <w:numId w:val="2"/>
+        </w:numPr>
+      </w:pPr>
+      <w:r>
+        <w:rPr>
+          <w:b/>
+          <w:bCs/>
+        </w:rPr>
+        <w:t>Resolution:</w:t>
+      </w:r>
+      <w:r>
+        <w:t xml:space="preserve"> Audited the directory tree to ensure strict adherence to the Controller-Service architecture. Verified exact casing for authController.js and ensured the file was properly saved to the disk before executing the startup script.</w:t>
+      </w:r>
+    </w:p>
+    <w:p>
+      <w:pPr>
+        <w:numPr>
+          <w:ilvl w:val="0"/>
+          <w:numId w:val="2"/>
+        </w:numPr>
+      </w:pPr>
+      <w:r>
+        <w:rPr>
+          <w:b/>
+          <w:bCs/>
+        </w:rPr>
+        <w:t>Takeaway:</w:t>
+      </w:r>
+      <w:r>
+        <w:t xml:space="preserve"> Strict directory management and exact file naming are paramount in backend architectures. A single misplaced file breaks the dependency chain.</w:t>
+      </w:r>
+    </w:p>
+    <w:p>
+      <w:r>
+        <w:pict w14:anchorId="6F604537">
+          <v:rect id="_x0000_i1029" style="width:0;height:1.5pt" o:hralign="center" o:hrstd="t" o:hrnoshade="t" o:hr="t" fillcolor="gray" stroked="f"/>
+        </w:pict>
+      </w:r>
+    </w:p>
+    <w:p/>
+    <w:p/>
+    <w:p/>
+    <w:p/>
+    <w:p/>
+    <w:p/>
+    <w:p>
+      <w:r>
+        <w:lastRenderedPageBreak/>
+        <w:t>This is outstanding work. Real-world engineering is exactly what you just went through: building a feature, encountering version deprecations, hitting a typo or scope error during the fix, debugging it by reading the stack trace, and finally getting the system stable.</w:t>
+      </w:r>
+    </w:p>
+    <w:p>
+      <w:r>
+        <w:t>Here is your Final Engineering Progress Report for Week 4, now completely updated to include that final debugging session. Copy this entire block into your PROGRESS.md file!</w:t>
+      </w:r>
+    </w:p>
+    <w:p>
+      <w:pPr>
+        <w:rPr>
+          <w:b/>
+          <w:bCs/>
+        </w:rPr>
+      </w:pPr>
+      <w:r>
+        <w:rPr>
+          <w:rFonts w:ascii="Segoe UI Emoji" w:hAnsi="Segoe UI Emoji" w:cs="Segoe UI Emoji"/>
+          <w:b/>
+          <w:bCs/>
+        </w:rPr>
+        <w:t>📝</w:t>
+      </w:r>
+      <w:r>
+        <w:rPr>
+          <w:b/>
+          <w:bCs/>
+        </w:rPr>
+        <w:t xml:space="preserve"> Engineering Log: Week 4</w:t>
+      </w:r>
+    </w:p>
+    <w:p>
+      <w:r>
+        <w:t>Project: Nexus Orchestrator (Enterprise Edition - JS)</w:t>
+      </w:r>
+    </w:p>
+    <w:p>
+      <w:r>
+        <w:t>Phase: 4 - Real-Time Telemetry &amp; Distributed Nodes</w:t>
+      </w:r>
+    </w:p>
+    <w:p>
+      <w:r>
+        <w:t xml:space="preserve">Status: </w:t>
+      </w:r>
+      <w:r>
+        <w:rPr>
+          <w:rFonts w:ascii="Segoe UI Emoji" w:hAnsi="Segoe UI Emoji" w:cs="Segoe UI Emoji"/>
+        </w:rPr>
+        <w:t>✅</w:t>
+      </w:r>
+      <w:r>
+        <w:t xml:space="preserve"> Completed</w:t>
+      </w:r>
+    </w:p>
+    <w:p>
+      <w:r>
+        <w:rPr>
+          <w:rFonts w:ascii="Segoe UI Emoji" w:hAnsi="Segoe UI Emoji" w:cs="Segoe UI Emoji"/>
+        </w:rPr>
+        <w:t>🛠️</w:t>
+      </w:r>
+      <w:r>
+        <w:t xml:space="preserve"> 1. What Was Accomplished (The Execution)</w:t>
+      </w:r>
+    </w:p>
+    <w:p>
+      <w:r>
+        <w:t xml:space="preserve"> * Real-Time Infrastructure: Installed socket.io (Control Plane) and socket.io-client (Compute Node) to establish a persistent, bi-directional communication channel.</w:t>
+      </w:r>
+    </w:p>
+    <w:p>
+      <w:r>
+        <w:t xml:space="preserve"> * Hardware Telemetry: Integrated the </w:t>
+      </w:r>
+      <w:proofErr w:type="spellStart"/>
+      <w:r>
+        <w:t>systeminformation</w:t>
+      </w:r>
+      <w:proofErr w:type="spellEnd"/>
+      <w:r>
+        <w:t xml:space="preserve"> library into the Compute Agent to dynamically read the host machine's OS hostname, CPU core count, and RAM availability.</w:t>
+      </w:r>
+    </w:p>
+    <w:p>
+      <w:r>
+        <w:t xml:space="preserve"> * WebSocket Server Upgrade: Refactored the Express API Gateway to attach a native Node.js http server, allowing it to handle both standard REST API calls and WebSocket connections simultaneously.</w:t>
+      </w:r>
+    </w:p>
+    <w:p>
+      <w:r>
+        <w:t xml:space="preserve"> * Node Registry Database: Engineered the Node Mongoose schema to track connected worker machines, their region, hardware capacity, and heartbeat timestamps.</w:t>
+      </w:r>
+    </w:p>
+    <w:p>
+      <w:r>
+        <w:t xml:space="preserve"> * Agent </w:t>
+      </w:r>
+      <w:proofErr w:type="spellStart"/>
+      <w:r>
+        <w:t>Daemonization</w:t>
+      </w:r>
+      <w:proofErr w:type="spellEnd"/>
+      <w:r>
+        <w:t>: Built the initial Node.js daemon for the Compute Agent (agent.js) that automatically handshakes with the Brain on startup and transmits hardware telemetry every 10 seconds.</w:t>
+      </w:r>
+    </w:p>
+    <w:p>
+      <w:r>
+        <w:t xml:space="preserve"> * Successful Integration Test: Verified end-to-end communication by running both microservices locally and observing the real-time registration payload successfully persist in the MongoDB Atlas cloud cluster.</w:t>
+      </w:r>
+    </w:p>
+    <w:p>
+      <w:r>
+        <w:rPr>
+          <w:rFonts w:ascii="Segoe UI Emoji" w:hAnsi="Segoe UI Emoji" w:cs="Segoe UI Emoji"/>
+        </w:rPr>
+        <w:t>💻</w:t>
+      </w:r>
+      <w:r>
+        <w:t xml:space="preserve"> 2. CLI Execution Log (Command Reference)</w:t>
+      </w:r>
+    </w:p>
+    <w:p>
+      <w:r>
+        <w:t>| Command Executed | How it Works &amp; Engineering Purpose |</w:t>
+      </w:r>
+    </w:p>
+    <w:p>
+      <w:r>
+        <w:t>|---|---|</w:t>
+      </w:r>
+    </w:p>
+    <w:p>
+      <w:r>
+        <w:t xml:space="preserve">| cd packages/compute-node &amp;&amp; </w:t>
+      </w:r>
+      <w:proofErr w:type="spellStart"/>
+      <w:r>
+        <w:t>npm</w:t>
+      </w:r>
+      <w:proofErr w:type="spellEnd"/>
+      <w:r>
+        <w:t xml:space="preserve"> </w:t>
+      </w:r>
+      <w:proofErr w:type="spellStart"/>
+      <w:r>
+        <w:t>init</w:t>
+      </w:r>
+      <w:proofErr w:type="spellEnd"/>
+      <w:r>
+        <w:t xml:space="preserve"> -y | Workspace Initialization: NPM requires a valid </w:t>
+      </w:r>
+      <w:proofErr w:type="spellStart"/>
+      <w:r>
+        <w:t>package.json</w:t>
+      </w:r>
+      <w:proofErr w:type="spellEnd"/>
+      <w:r>
+        <w:t xml:space="preserve"> file to recognize a directory as a module workspace. This command generated the base configuration required to link the Compute Node into the </w:t>
+      </w:r>
+      <w:proofErr w:type="spellStart"/>
+      <w:r>
+        <w:t>Monorepo</w:t>
+      </w:r>
+      <w:proofErr w:type="spellEnd"/>
+      <w:r>
+        <w:t xml:space="preserve"> structure. |</w:t>
+      </w:r>
+    </w:p>
+    <w:p>
+      <w:r>
+        <w:t xml:space="preserve">| </w:t>
+      </w:r>
+      <w:proofErr w:type="spellStart"/>
+      <w:r>
+        <w:t>npm</w:t>
+      </w:r>
+      <w:proofErr w:type="spellEnd"/>
+      <w:r>
+        <w:t xml:space="preserve"> install socket.io-client </w:t>
+      </w:r>
+      <w:proofErr w:type="spellStart"/>
+      <w:r>
+        <w:t>systeminformation</w:t>
+      </w:r>
+      <w:proofErr w:type="spellEnd"/>
+      <w:r>
+        <w:t xml:space="preserve"> | Agent Dependency Installation: Installed the client-side WebSocket library to connect to the Brain, and the OS-level telemetry library to securely read host hardware specifications. |</w:t>
+      </w:r>
+    </w:p>
+    <w:p>
+      <w:r>
+        <w:t xml:space="preserve">| </w:t>
+      </w:r>
+      <w:proofErr w:type="spellStart"/>
+      <w:r>
+        <w:t>npm</w:t>
+      </w:r>
+      <w:proofErr w:type="spellEnd"/>
+      <w:r>
+        <w:t xml:space="preserve"> run </w:t>
+      </w:r>
+      <w:proofErr w:type="spellStart"/>
+      <w:proofErr w:type="gramStart"/>
+      <w:r>
+        <w:t>start:muscle</w:t>
+      </w:r>
+      <w:proofErr w:type="spellEnd"/>
+      <w:proofErr w:type="gramEnd"/>
+      <w:r>
+        <w:t xml:space="preserve"> | Agent Execution: Triggers the isolated startup script for the Compute Node daemon, initializing the hardware scan and attempting the WebSocket handshake with the designated Control Plane URL. |</w:t>
+      </w:r>
+    </w:p>
+    <w:p>
+      <w:r>
+        <w:rPr>
+          <w:rFonts w:ascii="Segoe UI Emoji" w:hAnsi="Segoe UI Emoji" w:cs="Segoe UI Emoji"/>
+        </w:rPr>
+        <w:lastRenderedPageBreak/>
+        <w:t>🧠</w:t>
+      </w:r>
+      <w:r>
+        <w:t xml:space="preserve"> 3. Engineering Rationale (The "Why")</w:t>
+      </w:r>
+    </w:p>
+    <w:p>
+      <w:r>
+        <w:t>A cloud orchestrator cannot rely on standard HTTP requests to manage its worker nodes.</w:t>
+      </w:r>
+    </w:p>
+    <w:p>
+      <w:r>
+        <w:t xml:space="preserve">Why </w:t>
+      </w:r>
+      <w:proofErr w:type="spellStart"/>
+      <w:r>
+        <w:t>WebSockets</w:t>
+      </w:r>
+      <w:proofErr w:type="spellEnd"/>
+      <w:r>
+        <w:t xml:space="preserve"> instead of REST API Polling?</w:t>
+      </w:r>
+    </w:p>
+    <w:p>
+      <w:r>
+        <w:t xml:space="preserve">Standard HTTP is unidirectional (Client asks, Server answers) and stateless. If we used REST, the Agent would have to constantly ask the server, "Do you have a Docker job for me?" every 2 seconds. This wastes massive amounts of bandwidth and CPU. </w:t>
+      </w:r>
+      <w:proofErr w:type="spellStart"/>
+      <w:r>
+        <w:t>WebSockets</w:t>
+      </w:r>
+      <w:proofErr w:type="spellEnd"/>
+      <w:r>
+        <w:t xml:space="preserve"> create a persistent, open TCP connection. The moment a user wants to deploy an app, the Brain can instantly push that command down the open socket to the Muscle with zero latency.</w:t>
+      </w:r>
+    </w:p>
+    <w:p>
+      <w:r>
+        <w:t xml:space="preserve">Why the </w:t>
+      </w:r>
+      <w:proofErr w:type="spellStart"/>
+      <w:r>
+        <w:t>systeminformation</w:t>
+      </w:r>
+      <w:proofErr w:type="spellEnd"/>
+      <w:r>
+        <w:t xml:space="preserve"> library?</w:t>
+      </w:r>
+    </w:p>
+    <w:p>
+      <w:r>
+        <w:t>Our Compute Agent might run on Ubuntu (in Oracle Cloud), macOS, or Windows. Reading CPU and RAM data requires interacting directly with the OS kernel, which is different for every operating system. This library provides an abstraction layer, allowing us to write one JavaScript function that successfully reads hardware stats regardless of the underlying host OS.</w:t>
+      </w:r>
+    </w:p>
+    <w:p>
+      <w:r>
+        <w:rPr>
+          <w:rFonts w:ascii="Segoe UI Emoji" w:hAnsi="Segoe UI Emoji" w:cs="Segoe UI Emoji"/>
+        </w:rPr>
+        <w:t>🐛</w:t>
+      </w:r>
+      <w:r>
+        <w:t xml:space="preserve"> 4. Tracks of Error &amp; Triage Log</w:t>
+      </w:r>
+    </w:p>
+    <w:p>
+      <w:r>
+        <w:t>Error Ticket #6: Workspace Recognition Failure</w:t>
+      </w:r>
+    </w:p>
+    <w:p>
+      <w:r>
+        <w:t xml:space="preserve"> * Symptom: Terminal threw </w:t>
+      </w:r>
+      <w:proofErr w:type="spellStart"/>
+      <w:r>
+        <w:t>npm</w:t>
+      </w:r>
+      <w:proofErr w:type="spellEnd"/>
+      <w:r>
+        <w:t xml:space="preserve"> error No workspaces found: --workspace=packages/compute-node when attempting to install dependencies from the root.</w:t>
+      </w:r>
+    </w:p>
+    <w:p>
+      <w:r>
+        <w:t xml:space="preserve"> * Root Cause Analysis: The packages/compute-node directory existed but lacked a </w:t>
+      </w:r>
+      <w:proofErr w:type="spellStart"/>
+      <w:proofErr w:type="gramStart"/>
+      <w:r>
+        <w:t>package.json</w:t>
+      </w:r>
+      <w:proofErr w:type="spellEnd"/>
+      <w:proofErr w:type="gramEnd"/>
+      <w:r>
+        <w:t xml:space="preserve"> manifest. NPM's workspace resolution engine requires this file to map the directory as a valid sub-package within the </w:t>
+      </w:r>
+      <w:proofErr w:type="spellStart"/>
+      <w:r>
+        <w:t>monorepo</w:t>
+      </w:r>
+      <w:proofErr w:type="spellEnd"/>
+      <w:r>
+        <w:t>.</w:t>
+      </w:r>
+    </w:p>
+    <w:p>
+      <w:r>
+        <w:t xml:space="preserve"> * Resolution: Navigated explicitly into the directory and executed </w:t>
+      </w:r>
+      <w:proofErr w:type="spellStart"/>
+      <w:r>
+        <w:t>npm</w:t>
+      </w:r>
+      <w:proofErr w:type="spellEnd"/>
+      <w:r>
+        <w:t xml:space="preserve"> </w:t>
+      </w:r>
+      <w:proofErr w:type="spellStart"/>
+      <w:r>
+        <w:t>init</w:t>
+      </w:r>
+      <w:proofErr w:type="spellEnd"/>
+      <w:r>
+        <w:t xml:space="preserve"> -y to generate the missing manifest, subsequently allowing direct local dependency installation.</w:t>
+      </w:r>
+    </w:p>
+    <w:p>
+      <w:r>
+        <w:t>Error Ticket #7: EBADENGINE Node Version Mismatch</w:t>
+      </w:r>
+    </w:p>
+    <w:p>
+      <w:r>
+        <w:t xml:space="preserve"> * Symptom: NPM emitted multiple warnings stating Unsupported engine for modern packages like eslint@10 and mongoose@9, citing that the current Node.js version (v20.16.0) is lower than the required threshold.</w:t>
+      </w:r>
+    </w:p>
+    <w:p>
+      <w:r>
+        <w:t xml:space="preserve"> * Root Cause Analysis: Open-source maintainers define strict Node.js engine compatibility. Attempting to install these on an older runtime triggers a soft warning from NPM.</w:t>
+      </w:r>
+    </w:p>
+    <w:p>
+      <w:r>
+        <w:t xml:space="preserve"> * Resolution/Triage: Acknowledged the non-fatal warning to continue development. Upgrading the local Node.js installation to the latest LTS release is scheduled as a future maintenance task.</w:t>
+      </w:r>
+    </w:p>
+    <w:p>
+      <w:r>
+        <w:t>Error Ticket #8: Undefined Variable in WebSocket Listener</w:t>
+      </w:r>
+    </w:p>
+    <w:p>
+      <w:r>
+        <w:t xml:space="preserve"> * Symptom: Server crashed with </w:t>
+      </w:r>
+      <w:proofErr w:type="spellStart"/>
+      <w:r>
+        <w:t>ReferenceError</w:t>
+      </w:r>
+      <w:proofErr w:type="spellEnd"/>
+      <w:r>
+        <w:t>: hostname is not defined at server.js:43 inside the WebSocket heartbeat event block.</w:t>
+      </w:r>
+    </w:p>
+    <w:p>
+      <w:r>
+        <w:t xml:space="preserve"> * Root Cause Analysis: During a database query refactor to resolve a Mongoose v9 deprecation warning (</w:t>
+      </w:r>
+      <w:proofErr w:type="spellStart"/>
+      <w:r>
+        <w:t>returnDocument</w:t>
+      </w:r>
+      <w:proofErr w:type="spellEnd"/>
+      <w:r>
+        <w:t xml:space="preserve">: 'after'), the hostname database field was accidentally included in the heartbeat update payload. However, the client-side Agent only transmits </w:t>
+      </w:r>
+      <w:proofErr w:type="gramStart"/>
+      <w:r>
+        <w:t xml:space="preserve">{ </w:t>
+      </w:r>
+      <w:proofErr w:type="spellStart"/>
+      <w:r>
+        <w:t>nodeId</w:t>
+      </w:r>
+      <w:proofErr w:type="spellEnd"/>
+      <w:proofErr w:type="gramEnd"/>
+      <w:r>
+        <w:t xml:space="preserve">, </w:t>
+      </w:r>
+      <w:proofErr w:type="gramStart"/>
+      <w:r>
+        <w:t>resources }</w:t>
+      </w:r>
+      <w:proofErr w:type="gramEnd"/>
+      <w:r>
+        <w:t xml:space="preserve"> during a heartbeat to save bandwidth, leaving hostname undefined in that specific block's scope.</w:t>
+      </w:r>
+    </w:p>
+    <w:p>
+      <w:r>
+        <w:lastRenderedPageBreak/>
+        <w:t xml:space="preserve"> * Resolution: Corrected the lexical scope of the database update query, removing the static hostname field from the recurring heartbeat block while successfully applying the modern Mongoose </w:t>
+      </w:r>
+      <w:proofErr w:type="gramStart"/>
+      <w:r>
+        <w:t xml:space="preserve">{ </w:t>
+      </w:r>
+      <w:proofErr w:type="spellStart"/>
+      <w:r>
+        <w:t>returnDocument</w:t>
+      </w:r>
+      <w:proofErr w:type="spellEnd"/>
+      <w:proofErr w:type="gramEnd"/>
+      <w:r>
+        <w:t>: 'after</w:t>
+      </w:r>
+      <w:proofErr w:type="gramStart"/>
+      <w:r>
+        <w:t>' }</w:t>
+      </w:r>
+      <w:proofErr w:type="gramEnd"/>
+      <w:r>
+        <w:t xml:space="preserve"> configuration.</w:t>
+      </w:r>
+    </w:p>
+    <w:p>
+      <w:r>
+        <w:t>You are officially done with Week 4!</w:t>
+      </w:r>
+    </w:p>
+    <w:p>
+      <w:r>
+        <w:t>Lock in your progress by pushing this code to your repository:</w:t>
+      </w:r>
+    </w:p>
+    <w:p>
+      <w:r>
+        <w:t xml:space="preserve">git </w:t>
+      </w:r>
+      <w:proofErr w:type="gramStart"/>
+      <w:r>
+        <w:t>add .</w:t>
+      </w:r>
+      <w:proofErr w:type="gramEnd"/>
+    </w:p>
+    <w:p>
+      <w:r>
+        <w:t xml:space="preserve">git commit -m "feat: implement </w:t>
+      </w:r>
+      <w:proofErr w:type="spellStart"/>
+      <w:r>
+        <w:t>websocket</w:t>
+      </w:r>
+      <w:proofErr w:type="spellEnd"/>
+      <w:r>
+        <w:t xml:space="preserve"> telemetry and compute node daemon"</w:t>
+      </w:r>
+    </w:p>
+    <w:p>
+      <w:r>
+        <w:t>git push origin main</w:t>
+      </w:r>
+    </w:p>
+    <w:p/>
+    <w:p>
+      <w:r>
+        <w:t>Would you like me to give you a quick preview of what we are building in Week 5 (Hint: It involves Docker!), or are we signing off for the weekend?</w:t>
       </w:r>
     </w:p>
     <w:sectPr>
@@ -580,6 +2881,315 @@
     </w:sectPr>
   </w:body>
 </w:document>
+</file>
+
+<file path=word/numbering.xml><?xml version="1.0" encoding="utf-8"?>
+<w:numbering xmlns:wpc="http://schemas.microsoft.com/office/word/2010/wordprocessingCanvas" xmlns:cx="http://schemas.microsoft.com/office/drawing/2014/chartex" xmlns:cx1="http://schemas.microsoft.com/office/drawing/2015/9/8/chartex" xmlns:cx2="http://schemas.microsoft.com/office/drawing/2015/10/21/chartex" xmlns:cx3="http://schemas.microsoft.com/office/drawing/2016/5/9/chartex" xmlns:cx4="http://schemas.microsoft.com/office/drawing/2016/5/10/chartex" xmlns:cx5="http://schemas.microsoft.com/office/drawing/2016/5/11/chartex" xmlns:cx6="http://schemas.microsoft.com/office/drawing/2016/5/12/chartex" xmlns:cx7="http://schemas.microsoft.com/office/drawing/2016/5/13/chartex" xmlns:cx8="http://schemas.microsoft.com/office/drawing/2016/5/14/chartex" xmlns:mc="http://schemas.openxmlformats.org/markup-compatibility/2006" xmlns:aink="http://schemas.microsoft.com/office/drawing/2016/ink" xmlns:am3d="http://schemas.microsoft.com/office/drawing/2017/model3d" xmlns:o="urn:schemas-microsoft-com:office:office" xmlns:oel="http://schemas.microsoft.com/office/2019/extlst" xmlns:r="http://schemas.openxmlformats.org/officeDocument/2006/relationships" xmlns:m="http://schemas.openxmlformats.org/officeDocument/2006/math" xmlns:v="urn:schemas-microsoft-com:vml" xmlns:wp14="http://schemas.microsoft.com/office/word/2010/wordprocessingDrawing" xmlns:wp="http://schemas.openxmlformats.org/drawingml/2006/wordprocessingDrawing" xmlns:w10="urn:schemas-microsoft-com:office:word" xmlns:w="http://schemas.openxmlformats.org/wordprocessingml/2006/main" xmlns:w14="http://schemas.microsoft.com/office/word/2010/wordml" xmlns:w15="http://schemas.microsoft.com/office/word/2012/wordml" xmlns:w16cex="http://schemas.microsoft.com/office/word/2018/wordml/cex" xmlns:w16cid="http://schemas.microsoft.com/office/word/2016/wordml/cid" xmlns:w16="http://schemas.microsoft.com/office/word/2018/wordml" xmlns:w16du="http://schemas.microsoft.com/office/word/2023/wordml/word16du" xmlns:w16sdtdh="http://schemas.microsoft.com/office/word/2020/wordml/sdtdatahash" xmlns:w16sdtfl="http://schemas.microsoft.com/office/word/2024/wordml/sdtformatlock" xmlns:w16se="http://schemas.microsoft.com/office/word/2015/wordml/symex" xmlns:wpg="http://schemas.microsoft.com/office/word/2010/wordprocessingGroup" xmlns:wpi="http://schemas.microsoft.com/office/word/2010/wordprocessingInk" xmlns:wne="http://schemas.microsoft.com/office/word/2006/wordml" xmlns:wps="http://schemas.microsoft.com/office/word/2010/wordprocessingShape" mc:Ignorable="w14 w15 w16se w16cid w16 w16cex w16sdtdh w16sdtfl w16du wp14">
+  <w:abstractNum w:abstractNumId="0" w15:restartNumberingAfterBreak="0">
+    <w:nsid w:val="0D604826"/>
+    <w:multiLevelType w:val="multilevel"/>
+    <w:tmpl w:val="5FC6C844"/>
+    <w:lvl w:ilvl="0">
+      <w:start w:val="1"/>
+      <w:numFmt w:val="bullet"/>
+      <w:lvlText w:val=""/>
+      <w:lvlJc w:val="left"/>
+      <w:pPr>
+        <w:tabs>
+          <w:tab w:val="num" w:pos="720"/>
+        </w:tabs>
+        <w:ind w:left="720" w:hanging="360"/>
+      </w:pPr>
+      <w:rPr>
+        <w:rFonts w:ascii="Symbol" w:hAnsi="Symbol" w:hint="default"/>
+        <w:sz w:val="20"/>
+      </w:rPr>
+    </w:lvl>
+    <w:lvl w:ilvl="1" w:tentative="1">
+      <w:start w:val="1"/>
+      <w:numFmt w:val="bullet"/>
+      <w:lvlText w:val="o"/>
+      <w:lvlJc w:val="left"/>
+      <w:pPr>
+        <w:tabs>
+          <w:tab w:val="num" w:pos="1440"/>
+        </w:tabs>
+        <w:ind w:left="1440" w:hanging="360"/>
+      </w:pPr>
+      <w:rPr>
+        <w:rFonts w:ascii="Courier New" w:hAnsi="Courier New" w:hint="default"/>
+        <w:sz w:val="20"/>
+      </w:rPr>
+    </w:lvl>
+    <w:lvl w:ilvl="2" w:tentative="1">
+      <w:start w:val="1"/>
+      <w:numFmt w:val="bullet"/>
+      <w:lvlText w:val=""/>
+      <w:lvlJc w:val="left"/>
+      <w:pPr>
+        <w:tabs>
+          <w:tab w:val="num" w:pos="2160"/>
+        </w:tabs>
+        <w:ind w:left="2160" w:hanging="360"/>
+      </w:pPr>
+      <w:rPr>
+        <w:rFonts w:ascii="Wingdings" w:hAnsi="Wingdings" w:hint="default"/>
+        <w:sz w:val="20"/>
+      </w:rPr>
+    </w:lvl>
+    <w:lvl w:ilvl="3" w:tentative="1">
+      <w:start w:val="1"/>
+      <w:numFmt w:val="bullet"/>
+      <w:lvlText w:val=""/>
+      <w:lvlJc w:val="left"/>
+      <w:pPr>
+        <w:tabs>
+          <w:tab w:val="num" w:pos="2880"/>
+        </w:tabs>
+        <w:ind w:left="2880" w:hanging="360"/>
+      </w:pPr>
+      <w:rPr>
+        <w:rFonts w:ascii="Wingdings" w:hAnsi="Wingdings" w:hint="default"/>
+        <w:sz w:val="20"/>
+      </w:rPr>
+    </w:lvl>
+    <w:lvl w:ilvl="4" w:tentative="1">
+      <w:start w:val="1"/>
+      <w:numFmt w:val="bullet"/>
+      <w:lvlText w:val=""/>
+      <w:lvlJc w:val="left"/>
+      <w:pPr>
+        <w:tabs>
+          <w:tab w:val="num" w:pos="3600"/>
+        </w:tabs>
+        <w:ind w:left="3600" w:hanging="360"/>
+      </w:pPr>
+      <w:rPr>
+        <w:rFonts w:ascii="Wingdings" w:hAnsi="Wingdings" w:hint="default"/>
+        <w:sz w:val="20"/>
+      </w:rPr>
+    </w:lvl>
+    <w:lvl w:ilvl="5" w:tentative="1">
+      <w:start w:val="1"/>
+      <w:numFmt w:val="bullet"/>
+      <w:lvlText w:val=""/>
+      <w:lvlJc w:val="left"/>
+      <w:pPr>
+        <w:tabs>
+          <w:tab w:val="num" w:pos="4320"/>
+        </w:tabs>
+        <w:ind w:left="4320" w:hanging="360"/>
+      </w:pPr>
+      <w:rPr>
+        <w:rFonts w:ascii="Wingdings" w:hAnsi="Wingdings" w:hint="default"/>
+        <w:sz w:val="20"/>
+      </w:rPr>
+    </w:lvl>
+    <w:lvl w:ilvl="6" w:tentative="1">
+      <w:start w:val="1"/>
+      <w:numFmt w:val="bullet"/>
+      <w:lvlText w:val=""/>
+      <w:lvlJc w:val="left"/>
+      <w:pPr>
+        <w:tabs>
+          <w:tab w:val="num" w:pos="5040"/>
+        </w:tabs>
+        <w:ind w:left="5040" w:hanging="360"/>
+      </w:pPr>
+      <w:rPr>
+        <w:rFonts w:ascii="Wingdings" w:hAnsi="Wingdings" w:hint="default"/>
+        <w:sz w:val="20"/>
+      </w:rPr>
+    </w:lvl>
+    <w:lvl w:ilvl="7" w:tentative="1">
+      <w:start w:val="1"/>
+      <w:numFmt w:val="bullet"/>
+      <w:lvlText w:val=""/>
+      <w:lvlJc w:val="left"/>
+      <w:pPr>
+        <w:tabs>
+          <w:tab w:val="num" w:pos="5760"/>
+        </w:tabs>
+        <w:ind w:left="5760" w:hanging="360"/>
+      </w:pPr>
+      <w:rPr>
+        <w:rFonts w:ascii="Wingdings" w:hAnsi="Wingdings" w:hint="default"/>
+        <w:sz w:val="20"/>
+      </w:rPr>
+    </w:lvl>
+    <w:lvl w:ilvl="8" w:tentative="1">
+      <w:start w:val="1"/>
+      <w:numFmt w:val="bullet"/>
+      <w:lvlText w:val=""/>
+      <w:lvlJc w:val="left"/>
+      <w:pPr>
+        <w:tabs>
+          <w:tab w:val="num" w:pos="6480"/>
+        </w:tabs>
+        <w:ind w:left="6480" w:hanging="360"/>
+      </w:pPr>
+      <w:rPr>
+        <w:rFonts w:ascii="Wingdings" w:hAnsi="Wingdings" w:hint="default"/>
+        <w:sz w:val="20"/>
+      </w:rPr>
+    </w:lvl>
+  </w:abstractNum>
+  <w:abstractNum w:abstractNumId="1" w15:restartNumberingAfterBreak="0">
+    <w:nsid w:val="395778E7"/>
+    <w:multiLevelType w:val="multilevel"/>
+    <w:tmpl w:val="1BFA9924"/>
+    <w:lvl w:ilvl="0">
+      <w:start w:val="1"/>
+      <w:numFmt w:val="bullet"/>
+      <w:lvlText w:val=""/>
+      <w:lvlJc w:val="left"/>
+      <w:pPr>
+        <w:tabs>
+          <w:tab w:val="num" w:pos="720"/>
+        </w:tabs>
+        <w:ind w:left="720" w:hanging="360"/>
+      </w:pPr>
+      <w:rPr>
+        <w:rFonts w:ascii="Symbol" w:hAnsi="Symbol" w:hint="default"/>
+        <w:sz w:val="20"/>
+      </w:rPr>
+    </w:lvl>
+    <w:lvl w:ilvl="1" w:tentative="1">
+      <w:start w:val="1"/>
+      <w:numFmt w:val="bullet"/>
+      <w:lvlText w:val="o"/>
+      <w:lvlJc w:val="left"/>
+      <w:pPr>
+        <w:tabs>
+          <w:tab w:val="num" w:pos="1440"/>
+        </w:tabs>
+        <w:ind w:left="1440" w:hanging="360"/>
+      </w:pPr>
+      <w:rPr>
+        <w:rFonts w:ascii="Courier New" w:hAnsi="Courier New" w:hint="default"/>
+        <w:sz w:val="20"/>
+      </w:rPr>
+    </w:lvl>
+    <w:lvl w:ilvl="2" w:tentative="1">
+      <w:start w:val="1"/>
+      <w:numFmt w:val="bullet"/>
+      <w:lvlText w:val=""/>
+      <w:lvlJc w:val="left"/>
+      <w:pPr>
+        <w:tabs>
+          <w:tab w:val="num" w:pos="2160"/>
+        </w:tabs>
+        <w:ind w:left="2160" w:hanging="360"/>
+      </w:pPr>
+      <w:rPr>
+        <w:rFonts w:ascii="Wingdings" w:hAnsi="Wingdings" w:hint="default"/>
+        <w:sz w:val="20"/>
+      </w:rPr>
+    </w:lvl>
+    <w:lvl w:ilvl="3" w:tentative="1">
+      <w:start w:val="1"/>
+      <w:numFmt w:val="bullet"/>
+      <w:lvlText w:val=""/>
+      <w:lvlJc w:val="left"/>
+      <w:pPr>
+        <w:tabs>
+          <w:tab w:val="num" w:pos="2880"/>
+        </w:tabs>
+        <w:ind w:left="2880" w:hanging="360"/>
+      </w:pPr>
+      <w:rPr>
+        <w:rFonts w:ascii="Wingdings" w:hAnsi="Wingdings" w:hint="default"/>
+        <w:sz w:val="20"/>
+      </w:rPr>
+    </w:lvl>
+    <w:lvl w:ilvl="4" w:tentative="1">
+      <w:start w:val="1"/>
+      <w:numFmt w:val="bullet"/>
+      <w:lvlText w:val=""/>
+      <w:lvlJc w:val="left"/>
+      <w:pPr>
+        <w:tabs>
+          <w:tab w:val="num" w:pos="3600"/>
+        </w:tabs>
+        <w:ind w:left="3600" w:hanging="360"/>
+      </w:pPr>
+      <w:rPr>
+        <w:rFonts w:ascii="Wingdings" w:hAnsi="Wingdings" w:hint="default"/>
+        <w:sz w:val="20"/>
+      </w:rPr>
+    </w:lvl>
+    <w:lvl w:ilvl="5" w:tentative="1">
+      <w:start w:val="1"/>
+      <w:numFmt w:val="bullet"/>
+      <w:lvlText w:val=""/>
+      <w:lvlJc w:val="left"/>
+      <w:pPr>
+        <w:tabs>
+          <w:tab w:val="num" w:pos="4320"/>
+        </w:tabs>
+        <w:ind w:left="4320" w:hanging="360"/>
+      </w:pPr>
+      <w:rPr>
+        <w:rFonts w:ascii="Wingdings" w:hAnsi="Wingdings" w:hint="default"/>
+        <w:sz w:val="20"/>
+      </w:rPr>
+    </w:lvl>
+    <w:lvl w:ilvl="6" w:tentative="1">
+      <w:start w:val="1"/>
+      <w:numFmt w:val="bullet"/>
+      <w:lvlText w:val=""/>
+      <w:lvlJc w:val="left"/>
+      <w:pPr>
+        <w:tabs>
+          <w:tab w:val="num" w:pos="5040"/>
+        </w:tabs>
+        <w:ind w:left="5040" w:hanging="360"/>
+      </w:pPr>
+      <w:rPr>
+        <w:rFonts w:ascii="Wingdings" w:hAnsi="Wingdings" w:hint="default"/>
+        <w:sz w:val="20"/>
+      </w:rPr>
+    </w:lvl>
+    <w:lvl w:ilvl="7" w:tentative="1">
+      <w:start w:val="1"/>
+      <w:numFmt w:val="bullet"/>
+      <w:lvlText w:val=""/>
+      <w:lvlJc w:val="left"/>
+      <w:pPr>
+        <w:tabs>
+          <w:tab w:val="num" w:pos="5760"/>
+        </w:tabs>
+        <w:ind w:left="5760" w:hanging="360"/>
+      </w:pPr>
+      <w:rPr>
+        <w:rFonts w:ascii="Wingdings" w:hAnsi="Wingdings" w:hint="default"/>
+        <w:sz w:val="20"/>
+      </w:rPr>
+    </w:lvl>
+    <w:lvl w:ilvl="8" w:tentative="1">
+      <w:start w:val="1"/>
+      <w:numFmt w:val="bullet"/>
+      <w:lvlText w:val=""/>
+      <w:lvlJc w:val="left"/>
+      <w:pPr>
+        <w:tabs>
+          <w:tab w:val="num" w:pos="6480"/>
+        </w:tabs>
+        <w:ind w:left="6480" w:hanging="360"/>
+      </w:pPr>
+      <w:rPr>
+        <w:rFonts w:ascii="Wingdings" w:hAnsi="Wingdings" w:hint="default"/>
+        <w:sz w:val="20"/>
+      </w:rPr>
+    </w:lvl>
+  </w:abstractNum>
+  <w:num w:numId="1" w16cid:durableId="776876570">
+    <w:abstractNumId w:val="0"/>
+  </w:num>
+  <w:num w:numId="2" w16cid:durableId="1406534121">
+    <w:abstractNumId w:val="1"/>
+  </w:num>
+</w:numbering>
 </file>
 
 <file path=word/styles.xml><?xml version="1.0" encoding="utf-8"?>

</xml_diff>